<commit_message>
feat: complete hosting task
</commit_message>
<xml_diff>
--- a/AdditionalFiles/Размещение на хостинге_322_324_326.docx
+++ b/AdditionalFiles/Размещение на хостинге_322_324_326.docx
@@ -1,10 +1,9 @@
 
 <file path=word/document.xml><?xml version="1.0" encoding="utf-8"?>
-<w:document xmlns:o="urn:schemas-microsoft-com:office:office" xmlns:r="http://schemas.openxmlformats.org/officeDocument/2006/relationships" xmlns:v="urn:schemas-microsoft-com:vml" xmlns:w="http://schemas.openxmlformats.org/wordprocessingml/2006/main" xmlns:w10="urn:schemas-microsoft-com:office:word" xmlns:wp="http://schemas.openxmlformats.org/drawingml/2006/wordprocessingDrawing" xmlns:pic="http://schemas.openxmlformats.org/drawingml/2006/picture" xmlns:wps="http://schemas.microsoft.com/office/word/2010/wordprocessingShape" xmlns:wpg="http://schemas.microsoft.com/office/word/2010/wordprocessingGroup" xmlns:mc="http://schemas.openxmlformats.org/markup-compatibility/2006" xmlns:wp14="http://schemas.microsoft.com/office/word/2010/wordprocessingDrawing" xmlns:w14="http://schemas.microsoft.com/office/word/2010/wordml" xmlns:w15="http://schemas.microsoft.com/office/word/2012/wordml" mc:Ignorable="w14 wp14 w15">
+<w:document xmlns:wpc="http://schemas.microsoft.com/office/word/2010/wordprocessingCanvas" xmlns:cx="http://schemas.microsoft.com/office/drawing/2014/chartex" xmlns:cx1="http://schemas.microsoft.com/office/drawing/2015/9/8/chartex" xmlns:cx2="http://schemas.microsoft.com/office/drawing/2015/10/21/chartex" xmlns:cx3="http://schemas.microsoft.com/office/drawing/2016/5/9/chartex" xmlns:cx4="http://schemas.microsoft.com/office/drawing/2016/5/10/chartex" xmlns:cx5="http://schemas.microsoft.com/office/drawing/2016/5/11/chartex" xmlns:cx6="http://schemas.microsoft.com/office/drawing/2016/5/12/chartex" xmlns:cx7="http://schemas.microsoft.com/office/drawing/2016/5/13/chartex" xmlns:cx8="http://schemas.microsoft.com/office/drawing/2016/5/14/chartex" xmlns:mc="http://schemas.openxmlformats.org/markup-compatibility/2006" xmlns:aink="http://schemas.microsoft.com/office/drawing/2016/ink" xmlns:am3d="http://schemas.microsoft.com/office/drawing/2017/model3d" xmlns:o="urn:schemas-microsoft-com:office:office" xmlns:oel="http://schemas.microsoft.com/office/2019/extlst" xmlns:r="http://schemas.openxmlformats.org/officeDocument/2006/relationships" xmlns:m="http://schemas.openxmlformats.org/officeDocument/2006/math" xmlns:v="urn:schemas-microsoft-com:vml" xmlns:wp14="http://schemas.microsoft.com/office/word/2010/wordprocessingDrawing" xmlns:wp="http://schemas.openxmlformats.org/drawingml/2006/wordprocessingDrawing" xmlns:w10="urn:schemas-microsoft-com:office:word" xmlns:w="http://schemas.openxmlformats.org/wordprocessingml/2006/main" xmlns:w14="http://schemas.microsoft.com/office/word/2010/wordml" xmlns:w15="http://schemas.microsoft.com/office/word/2012/wordml" xmlns:w16cex="http://schemas.microsoft.com/office/word/2018/wordml/cex" xmlns:w16cid="http://schemas.microsoft.com/office/word/2016/wordml/cid" xmlns:w16="http://schemas.microsoft.com/office/word/2018/wordml" xmlns:w16du="http://schemas.microsoft.com/office/word/2023/wordml/word16du" xmlns:w16sdtdh="http://schemas.microsoft.com/office/word/2020/wordml/sdtdatahash" xmlns:w16sdtfl="http://schemas.microsoft.com/office/word/2024/wordml/sdtformatlock" xmlns:w16se="http://schemas.microsoft.com/office/word/2015/wordml/symex" xmlns:wpg="http://schemas.microsoft.com/office/word/2010/wordprocessingGroup" xmlns:wpi="http://schemas.microsoft.com/office/word/2010/wordprocessingInk" xmlns:wne="http://schemas.microsoft.com/office/word/2006/wordml" xmlns:wps="http://schemas.microsoft.com/office/word/2010/wordprocessingShape" mc:Ignorable="w14 w15 w16se w16cid w16 w16cex w16sdtdh w16sdtfl w16du wp14">
   <w:body>
     <w:p>
       <w:pPr>
-        <w:pStyle w:val="Normal"/>
         <w:jc w:val="center"/>
         <w:rPr>
           <w:rFonts w:ascii="Times New Roman" w:hAnsi="Times New Roman" w:cs="Times New Roman"/>
@@ -16,7 +15,7 @@
       </w:pPr>
       <w:r>
         <w:rPr>
-          <w:rFonts w:cs="Times New Roman" w:ascii="Times New Roman" w:hAnsi="Times New Roman"/>
+          <w:rFonts w:ascii="Times New Roman" w:hAnsi="Times New Roman" w:cs="Times New Roman"/>
           <w:b/>
           <w:bCs/>
           <w:sz w:val="28"/>
@@ -27,7 +26,7 @@
     </w:p>
     <w:p>
       <w:pPr>
-        <w:pStyle w:val="ListParagraph"/>
+        <w:pStyle w:val="af0"/>
         <w:numPr>
           <w:ilvl w:val="0"/>
           <w:numId w:val="1"/>
@@ -40,7 +39,7 @@
       </w:pPr>
       <w:r>
         <w:rPr>
-          <w:rFonts w:cs="Times New Roman" w:ascii="Times New Roman" w:hAnsi="Times New Roman"/>
+          <w:rFonts w:ascii="Times New Roman" w:hAnsi="Times New Roman" w:cs="Times New Roman"/>
           <w:sz w:val="28"/>
           <w:szCs w:val="28"/>
         </w:rPr>
@@ -49,7 +48,7 @@
     </w:p>
     <w:p>
       <w:pPr>
-        <w:pStyle w:val="ListParagraph"/>
+        <w:pStyle w:val="af0"/>
         <w:numPr>
           <w:ilvl w:val="0"/>
           <w:numId w:val="1"/>
@@ -62,7 +61,7 @@
       </w:pPr>
       <w:r>
         <w:rPr>
-          <w:rFonts w:cs="Times New Roman" w:ascii="Times New Roman" w:hAnsi="Times New Roman"/>
+          <w:rFonts w:ascii="Times New Roman" w:hAnsi="Times New Roman" w:cs="Times New Roman"/>
           <w:sz w:val="28"/>
           <w:szCs w:val="28"/>
         </w:rPr>
@@ -71,7 +70,7 @@
     </w:p>
     <w:p>
       <w:pPr>
-        <w:pStyle w:val="ListParagraph"/>
+        <w:pStyle w:val="af0"/>
         <w:numPr>
           <w:ilvl w:val="0"/>
           <w:numId w:val="1"/>
@@ -84,7 +83,7 @@
       </w:pPr>
       <w:r>
         <w:rPr>
-          <w:rFonts w:cs="Times New Roman" w:ascii="Times New Roman" w:hAnsi="Times New Roman"/>
+          <w:rFonts w:ascii="Times New Roman" w:hAnsi="Times New Roman" w:cs="Times New Roman"/>
           <w:sz w:val="28"/>
           <w:szCs w:val="28"/>
         </w:rPr>
@@ -93,17 +92,18 @@
     </w:p>
     <w:p>
       <w:pPr>
-        <w:pStyle w:val="Normal"/>
-        <w:rPr>
-          <w:rFonts w:ascii="Times New Roman" w:hAnsi="Times New Roman" w:cs="Times New Roman"/>
-          <w:sz w:val="28"/>
-          <w:szCs w:val="28"/>
-        </w:rPr>
-      </w:pPr>
-      <w:r>
-        <w:rPr/>
+        <w:rPr>
+          <w:rFonts w:ascii="Times New Roman" w:hAnsi="Times New Roman" w:cs="Times New Roman"/>
+          <w:sz w:val="28"/>
+          <w:szCs w:val="28"/>
+        </w:rPr>
+      </w:pPr>
+      <w:r>
+        <w:rPr>
+          <w:noProof/>
+        </w:rPr>
         <w:drawing>
-          <wp:inline distT="0" distB="0" distL="0" distR="0">
+          <wp:inline distT="0" distB="0" distL="0" distR="0" wp14:anchorId="62FA4BE1" wp14:editId="373DD347">
             <wp:extent cx="5934075" cy="2809875"/>
             <wp:effectExtent l="0" t="0" r="0" b="0"/>
             <wp:docPr id="1" name="Рисунок 3"/>
@@ -120,7 +120,7 @@
                     </pic:cNvPicPr>
                   </pic:nvPicPr>
                   <pic:blipFill>
-                    <a:blip r:embed="rId2"/>
+                    <a:blip r:embed="rId5"/>
                     <a:stretch>
                       <a:fillRect/>
                     </a:stretch>
@@ -144,7 +144,7 @@
     </w:p>
     <w:p>
       <w:pPr>
-        <w:pStyle w:val="ListParagraph"/>
+        <w:pStyle w:val="af0"/>
         <w:numPr>
           <w:ilvl w:val="0"/>
           <w:numId w:val="1"/>
@@ -157,7 +157,7 @@
       </w:pPr>
       <w:r>
         <w:rPr>
-          <w:rFonts w:cs="Times New Roman" w:ascii="Times New Roman" w:hAnsi="Times New Roman"/>
+          <w:rFonts w:ascii="Times New Roman" w:hAnsi="Times New Roman" w:cs="Times New Roman"/>
           <w:sz w:val="28"/>
           <w:szCs w:val="28"/>
         </w:rPr>
@@ -165,7 +165,7 @@
       </w:r>
       <w:r>
         <w:rPr>
-          <w:rFonts w:cs="Times New Roman" w:ascii="Times New Roman" w:hAnsi="Times New Roman"/>
+          <w:rFonts w:ascii="Times New Roman" w:hAnsi="Times New Roman" w:cs="Times New Roman"/>
           <w:sz w:val="28"/>
           <w:szCs w:val="28"/>
           <w:lang w:val="en-US"/>
@@ -174,17 +174,26 @@
       </w:r>
       <w:r>
         <w:rPr>
-          <w:rFonts w:cs="Times New Roman" w:ascii="Times New Roman" w:hAnsi="Times New Roman"/>
+          <w:rFonts w:ascii="Times New Roman" w:hAnsi="Times New Roman" w:cs="Times New Roman"/>
           <w:sz w:val="28"/>
           <w:szCs w:val="28"/>
         </w:rPr>
         <w:t xml:space="preserve"> или ВК</w:t>
+      </w:r>
+      <w:r>
+        <w:rPr>
+          <w:rFonts w:ascii="Times New Roman" w:hAnsi="Times New Roman" w:cs="Times New Roman"/>
+          <w:sz w:val="28"/>
+          <w:szCs w:val="28"/>
+        </w:rPr>
         <w:br/>
       </w:r>
       <w:r>
-        <w:rPr/>
+        <w:rPr>
+          <w:noProof/>
+        </w:rPr>
         <w:drawing>
-          <wp:inline distT="0" distB="0" distL="0" distR="0">
+          <wp:inline distT="0" distB="0" distL="0" distR="0" wp14:anchorId="59DF0AC8" wp14:editId="5CAD7924">
             <wp:extent cx="5934075" cy="3495675"/>
             <wp:effectExtent l="0" t="0" r="0" b="0"/>
             <wp:docPr id="2" name="Рисунок 4"/>
@@ -201,7 +210,7 @@
                     </pic:cNvPicPr>
                   </pic:nvPicPr>
                   <pic:blipFill>
-                    <a:blip r:embed="rId3"/>
+                    <a:blip r:embed="rId6"/>
                     <a:stretch>
                       <a:fillRect/>
                     </a:stretch>
@@ -225,17 +234,19 @@
     </w:p>
     <w:p>
       <w:pPr>
-        <w:pStyle w:val="Normal"/>
-        <w:rPr>
-          <w:rFonts w:ascii="Times New Roman" w:hAnsi="Times New Roman" w:cs="Times New Roman"/>
-          <w:sz w:val="28"/>
-          <w:szCs w:val="28"/>
-        </w:rPr>
-      </w:pPr>
-      <w:r>
-        <w:rPr/>
+        <w:rPr>
+          <w:rFonts w:ascii="Times New Roman" w:hAnsi="Times New Roman" w:cs="Times New Roman"/>
+          <w:sz w:val="28"/>
+          <w:szCs w:val="28"/>
+        </w:rPr>
+      </w:pPr>
+      <w:r>
+        <w:rPr>
+          <w:noProof/>
+        </w:rPr>
+        <w:lastRenderedPageBreak/>
         <w:drawing>
-          <wp:inline distT="0" distB="0" distL="0" distR="0">
+          <wp:inline distT="0" distB="0" distL="0" distR="0" wp14:anchorId="060D35CB" wp14:editId="43D56CCF">
             <wp:extent cx="5934075" cy="3381375"/>
             <wp:effectExtent l="0" t="0" r="0" b="0"/>
             <wp:docPr id="3" name="Рисунок 2"/>
@@ -252,7 +263,7 @@
                     </pic:cNvPicPr>
                   </pic:nvPicPr>
                   <pic:blipFill>
-                    <a:blip r:embed="rId4"/>
+                    <a:blip r:embed="rId7"/>
                     <a:stretch>
                       <a:fillRect/>
                     </a:stretch>
@@ -276,26 +287,34 @@
     </w:p>
     <w:p>
       <w:pPr>
-        <w:pStyle w:val="Normal"/>
-        <w:rPr>
-          <w:rFonts w:ascii="Times New Roman" w:hAnsi="Times New Roman" w:cs="Times New Roman"/>
-          <w:sz w:val="28"/>
-          <w:szCs w:val="28"/>
-        </w:rPr>
-      </w:pPr>
-      <w:r>
-        <w:rPr>
-          <w:rFonts w:cs="Times New Roman" w:ascii="Times New Roman" w:hAnsi="Times New Roman"/>
+        <w:rPr>
+          <w:rFonts w:ascii="Times New Roman" w:hAnsi="Times New Roman" w:cs="Times New Roman"/>
+          <w:sz w:val="28"/>
+          <w:szCs w:val="28"/>
+        </w:rPr>
+      </w:pPr>
+      <w:r>
+        <w:rPr>
+          <w:rFonts w:ascii="Times New Roman" w:hAnsi="Times New Roman" w:cs="Times New Roman"/>
           <w:sz w:val="28"/>
           <w:szCs w:val="28"/>
         </w:rPr>
         <w:t>После активации аккаунта появится окно</w:t>
+      </w:r>
+      <w:r>
+        <w:rPr>
+          <w:rFonts w:ascii="Times New Roman" w:hAnsi="Times New Roman" w:cs="Times New Roman"/>
+          <w:sz w:val="28"/>
+          <w:szCs w:val="28"/>
+        </w:rPr>
         <w:br/>
       </w:r>
       <w:r>
-        <w:rPr/>
+        <w:rPr>
+          <w:noProof/>
+        </w:rPr>
         <w:drawing>
-          <wp:inline distT="0" distB="0" distL="0" distR="0">
+          <wp:inline distT="0" distB="0" distL="0" distR="0" wp14:anchorId="6DBC26A6" wp14:editId="6623AC42">
             <wp:extent cx="5924550" cy="2019300"/>
             <wp:effectExtent l="0" t="0" r="0" b="0"/>
             <wp:docPr id="4" name="Рисунок 5"/>
@@ -312,7 +331,7 @@
                     </pic:cNvPicPr>
                   </pic:nvPicPr>
                   <pic:blipFill>
-                    <a:blip r:embed="rId5"/>
+                    <a:blip r:embed="rId8"/>
                     <a:stretch>
                       <a:fillRect/>
                     </a:stretch>
@@ -336,16 +355,15 @@
     </w:p>
     <w:p>
       <w:pPr>
-        <w:pStyle w:val="Normal"/>
-        <w:rPr>
-          <w:rFonts w:ascii="Times New Roman" w:hAnsi="Times New Roman" w:cs="Times New Roman"/>
-          <w:sz w:val="28"/>
-          <w:szCs w:val="28"/>
-        </w:rPr>
-      </w:pPr>
-      <w:r>
-        <w:rPr>
-          <w:rFonts w:cs="Times New Roman" w:ascii="Times New Roman" w:hAnsi="Times New Roman"/>
+        <w:rPr>
+          <w:rFonts w:ascii="Times New Roman" w:hAnsi="Times New Roman" w:cs="Times New Roman"/>
+          <w:sz w:val="28"/>
+          <w:szCs w:val="28"/>
+        </w:rPr>
+      </w:pPr>
+      <w:r>
+        <w:rPr>
+          <w:rFonts w:ascii="Times New Roman" w:hAnsi="Times New Roman" w:cs="Times New Roman"/>
           <w:sz w:val="28"/>
           <w:szCs w:val="28"/>
         </w:rPr>
@@ -354,17 +372,18 @@
     </w:p>
     <w:p>
       <w:pPr>
-        <w:pStyle w:val="Normal"/>
-        <w:rPr>
-          <w:rFonts w:ascii="Times New Roman" w:hAnsi="Times New Roman" w:cs="Times New Roman"/>
-          <w:sz w:val="28"/>
-          <w:szCs w:val="28"/>
-        </w:rPr>
-      </w:pPr>
-      <w:r>
-        <w:rPr/>
+        <w:rPr>
+          <w:rFonts w:ascii="Times New Roman" w:hAnsi="Times New Roman" w:cs="Times New Roman"/>
+          <w:sz w:val="28"/>
+          <w:szCs w:val="28"/>
+        </w:rPr>
+      </w:pPr>
+      <w:r>
+        <w:rPr>
+          <w:noProof/>
+        </w:rPr>
         <w:drawing>
-          <wp:inline distT="0" distB="0" distL="0" distR="0">
+          <wp:inline distT="0" distB="0" distL="0" distR="0" wp14:anchorId="019446DB" wp14:editId="306F0219">
             <wp:extent cx="5924550" cy="2419350"/>
             <wp:effectExtent l="0" t="0" r="0" b="0"/>
             <wp:docPr id="5" name="Рисунок 6"/>
@@ -381,7 +400,7 @@
                     </pic:cNvPicPr>
                   </pic:nvPicPr>
                   <pic:blipFill>
-                    <a:blip r:embed="rId6"/>
+                    <a:blip r:embed="rId9"/>
                     <a:stretch>
                       <a:fillRect/>
                     </a:stretch>
@@ -405,24 +424,15 @@
     </w:p>
     <w:p>
       <w:pPr>
-        <w:pStyle w:val="Normal"/>
-        <w:rPr>
-          <w:rFonts w:ascii="Times New Roman" w:hAnsi="Times New Roman" w:cs="Times New Roman"/>
-          <w:sz w:val="28"/>
-          <w:szCs w:val="28"/>
-        </w:rPr>
-      </w:pPr>
-      <w:r>
-        <w:rPr>
-          <w:rFonts w:cs="Times New Roman" w:ascii="Times New Roman" w:hAnsi="Times New Roman"/>
-          <w:sz w:val="28"/>
-          <w:szCs w:val="28"/>
-        </w:rPr>
-      </w:r>
-    </w:p>
-    <w:p>
-      <w:pPr>
-        <w:pStyle w:val="Normal"/>
+        <w:rPr>
+          <w:rFonts w:ascii="Times New Roman" w:hAnsi="Times New Roman" w:cs="Times New Roman"/>
+          <w:sz w:val="28"/>
+          <w:szCs w:val="28"/>
+        </w:rPr>
+      </w:pPr>
+    </w:p>
+    <w:p>
+      <w:pPr>
         <w:rPr>
           <w:rFonts w:ascii="Times New Roman" w:hAnsi="Times New Roman" w:cs="Times New Roman"/>
           <w:sz w:val="28"/>
@@ -430,18 +440,10 @@
           <w:lang w:val="en-US"/>
         </w:rPr>
       </w:pPr>
-      <w:r>
-        <w:rPr>
-          <w:rFonts w:cs="Times New Roman" w:ascii="Times New Roman" w:hAnsi="Times New Roman"/>
-          <w:sz w:val="28"/>
-          <w:szCs w:val="28"/>
-          <w:lang w:val="en-US"/>
-        </w:rPr>
-      </w:r>
-    </w:p>
-    <w:p>
-      <w:pPr>
-        <w:pStyle w:val="ListParagraph"/>
+    </w:p>
+    <w:p>
+      <w:pPr>
+        <w:pStyle w:val="af0"/>
         <w:numPr>
           <w:ilvl w:val="0"/>
           <w:numId w:val="1"/>
@@ -454,26 +456,46 @@
       </w:pPr>
       <w:r>
         <w:rPr>
-          <w:rFonts w:cs="Times New Roman" w:ascii="Times New Roman" w:hAnsi="Times New Roman"/>
-          <w:sz w:val="28"/>
-          <w:szCs w:val="28"/>
-        </w:rPr>
-        <w:t>Выполните команду Добавить базу данных(Нажать на +)</w:t>
-      </w:r>
-    </w:p>
-    <w:p>
-      <w:pPr>
-        <w:pStyle w:val="Normal"/>
-        <w:rPr>
-          <w:rFonts w:ascii="Times New Roman" w:hAnsi="Times New Roman" w:cs="Times New Roman"/>
-          <w:sz w:val="28"/>
-          <w:szCs w:val="28"/>
-        </w:rPr>
-      </w:pPr>
-      <w:r>
-        <w:rPr/>
+          <w:rFonts w:ascii="Times New Roman" w:hAnsi="Times New Roman" w:cs="Times New Roman"/>
+          <w:sz w:val="28"/>
+          <w:szCs w:val="28"/>
+        </w:rPr>
+        <w:t xml:space="preserve">Выполните команду Добавить базу </w:t>
+      </w:r>
+      <w:proofErr w:type="gramStart"/>
+      <w:r>
+        <w:rPr>
+          <w:rFonts w:ascii="Times New Roman" w:hAnsi="Times New Roman" w:cs="Times New Roman"/>
+          <w:sz w:val="28"/>
+          <w:szCs w:val="28"/>
+        </w:rPr>
+        <w:t>данных(</w:t>
+      </w:r>
+      <w:proofErr w:type="gramEnd"/>
+      <w:r>
+        <w:rPr>
+          <w:rFonts w:ascii="Times New Roman" w:hAnsi="Times New Roman" w:cs="Times New Roman"/>
+          <w:sz w:val="28"/>
+          <w:szCs w:val="28"/>
+        </w:rPr>
+        <w:t>Нажать на +)</w:t>
+      </w:r>
+    </w:p>
+    <w:p>
+      <w:pPr>
+        <w:rPr>
+          <w:rFonts w:ascii="Times New Roman" w:hAnsi="Times New Roman" w:cs="Times New Roman"/>
+          <w:sz w:val="28"/>
+          <w:szCs w:val="28"/>
+        </w:rPr>
+      </w:pPr>
+      <w:r>
+        <w:rPr>
+          <w:noProof/>
+        </w:rPr>
+        <w:lastRenderedPageBreak/>
         <w:drawing>
-          <wp:inline distT="0" distB="0" distL="0" distR="0">
+          <wp:inline distT="0" distB="0" distL="0" distR="0" wp14:anchorId="2DB037F3" wp14:editId="5C5F3377">
             <wp:extent cx="5940425" cy="3341370"/>
             <wp:effectExtent l="0" t="0" r="0" b="0"/>
             <wp:docPr id="6" name="Рисунок 1" descr="Изображение выглядит как текст, снимок экрана, программное обеспечение, Значок на компьютере&#10;&#10;Автоматически созданное описание"/>
@@ -490,7 +512,7 @@
                     </pic:cNvPicPr>
                   </pic:nvPicPr>
                   <pic:blipFill>
-                    <a:blip r:embed="rId7"/>
+                    <a:blip r:embed="rId10"/>
                     <a:stretch>
                       <a:fillRect/>
                     </a:stretch>
@@ -514,42 +536,35 @@
     </w:p>
     <w:p>
       <w:pPr>
-        <w:pStyle w:val="Normal"/>
-        <w:rPr>
-          <w:rFonts w:ascii="Times New Roman" w:hAnsi="Times New Roman" w:cs="Times New Roman"/>
-          <w:sz w:val="28"/>
-          <w:szCs w:val="28"/>
-        </w:rPr>
-      </w:pPr>
-      <w:r>
-        <w:rPr>
-          <w:rFonts w:cs="Times New Roman" w:ascii="Times New Roman" w:hAnsi="Times New Roman"/>
-          <w:sz w:val="28"/>
-          <w:szCs w:val="28"/>
-        </w:rPr>
-      </w:r>
-    </w:p>
-    <w:p>
-      <w:pPr>
-        <w:pStyle w:val="Normal"/>
-        <w:rPr>
-          <w:rFonts w:ascii="Times New Roman" w:hAnsi="Times New Roman" w:cs="Times New Roman"/>
-          <w:sz w:val="28"/>
-          <w:szCs w:val="28"/>
-        </w:rPr>
-      </w:pPr>
-      <w:r>
-        <w:rPr>
-          <w:rFonts w:cs="Times New Roman" w:ascii="Times New Roman" w:hAnsi="Times New Roman"/>
+        <w:rPr>
+          <w:rFonts w:ascii="Times New Roman" w:hAnsi="Times New Roman" w:cs="Times New Roman"/>
+          <w:sz w:val="28"/>
+          <w:szCs w:val="28"/>
+        </w:rPr>
+      </w:pPr>
+    </w:p>
+    <w:p>
+      <w:pPr>
+        <w:rPr>
+          <w:rFonts w:ascii="Times New Roman" w:hAnsi="Times New Roman" w:cs="Times New Roman"/>
+          <w:sz w:val="28"/>
+          <w:szCs w:val="28"/>
+        </w:rPr>
+      </w:pPr>
+      <w:r>
+        <w:rPr>
+          <w:rFonts w:ascii="Times New Roman" w:hAnsi="Times New Roman" w:cs="Times New Roman"/>
           <w:sz w:val="28"/>
           <w:szCs w:val="28"/>
         </w:rPr>
         <w:t>Создание базы данных</w:t>
       </w:r>
       <w:r>
-        <w:rPr/>
+        <w:rPr>
+          <w:noProof/>
+        </w:rPr>
         <w:drawing>
-          <wp:inline distT="0" distB="0" distL="0" distR="0">
+          <wp:inline distT="0" distB="0" distL="0" distR="0" wp14:anchorId="4B4637AE" wp14:editId="5FD2EF77">
             <wp:extent cx="5934075" cy="2495550"/>
             <wp:effectExtent l="0" t="0" r="0" b="0"/>
             <wp:docPr id="7" name="Рисунок 7"/>
@@ -566,7 +581,7 @@
                     </pic:cNvPicPr>
                   </pic:nvPicPr>
                   <pic:blipFill>
-                    <a:blip r:embed="rId8"/>
+                    <a:blip r:embed="rId11"/>
                     <a:stretch>
                       <a:fillRect/>
                     </a:stretch>
@@ -590,16 +605,16 @@
     </w:p>
     <w:p>
       <w:pPr>
-        <w:pStyle w:val="ListParagraph"/>
-        <w:rPr>
-          <w:rFonts w:ascii="Times New Roman" w:hAnsi="Times New Roman" w:cs="Times New Roman"/>
-          <w:sz w:val="28"/>
-          <w:szCs w:val="28"/>
-        </w:rPr>
-      </w:pPr>
-      <w:r>
-        <w:rPr>
-          <w:rFonts w:cs="Times New Roman" w:ascii="Times New Roman" w:hAnsi="Times New Roman"/>
+        <w:pStyle w:val="af0"/>
+        <w:rPr>
+          <w:rFonts w:ascii="Times New Roman" w:hAnsi="Times New Roman" w:cs="Times New Roman"/>
+          <w:sz w:val="28"/>
+          <w:szCs w:val="28"/>
+        </w:rPr>
+      </w:pPr>
+      <w:r>
+        <w:rPr>
+          <w:rFonts w:ascii="Times New Roman" w:hAnsi="Times New Roman" w:cs="Times New Roman"/>
           <w:sz w:val="28"/>
           <w:szCs w:val="28"/>
         </w:rPr>
@@ -608,16 +623,16 @@
     </w:p>
     <w:p>
       <w:pPr>
-        <w:pStyle w:val="ListParagraph"/>
-        <w:rPr>
-          <w:rFonts w:ascii="Times New Roman" w:hAnsi="Times New Roman" w:cs="Times New Roman"/>
-          <w:sz w:val="28"/>
-          <w:szCs w:val="28"/>
-        </w:rPr>
-      </w:pPr>
-      <w:r>
-        <w:rPr>
-          <w:rFonts w:cs="Times New Roman" w:ascii="Times New Roman" w:hAnsi="Times New Roman"/>
+        <w:pStyle w:val="af0"/>
+        <w:rPr>
+          <w:rFonts w:ascii="Times New Roman" w:hAnsi="Times New Roman" w:cs="Times New Roman"/>
+          <w:sz w:val="28"/>
+          <w:szCs w:val="28"/>
+        </w:rPr>
+      </w:pPr>
+      <w:r>
+        <w:rPr>
+          <w:rFonts w:ascii="Times New Roman" w:hAnsi="Times New Roman" w:cs="Times New Roman"/>
           <w:sz w:val="28"/>
           <w:szCs w:val="28"/>
         </w:rPr>
@@ -626,34 +641,28 @@
     </w:p>
     <w:p>
       <w:pPr>
-        <w:pStyle w:val="Normal"/>
-        <w:rPr>
-          <w:rFonts w:ascii="Times New Roman" w:hAnsi="Times New Roman" w:cs="Times New Roman"/>
-          <w:sz w:val="28"/>
-          <w:szCs w:val="28"/>
-        </w:rPr>
-      </w:pPr>
-      <w:r>
-        <w:rPr>
-          <w:rFonts w:cs="Times New Roman" w:ascii="Times New Roman" w:hAnsi="Times New Roman"/>
-          <w:sz w:val="28"/>
-          <w:szCs w:val="28"/>
-        </w:rPr>
-      </w:r>
-    </w:p>
-    <w:p>
-      <w:pPr>
-        <w:pStyle w:val="Normal"/>
-        <w:rPr>
-          <w:rFonts w:ascii="Times New Roman" w:hAnsi="Times New Roman" w:cs="Times New Roman"/>
-          <w:sz w:val="28"/>
-          <w:szCs w:val="28"/>
-        </w:rPr>
-      </w:pPr>
-      <w:r>
-        <w:rPr/>
+        <w:rPr>
+          <w:rFonts w:ascii="Times New Roman" w:hAnsi="Times New Roman" w:cs="Times New Roman"/>
+          <w:sz w:val="28"/>
+          <w:szCs w:val="28"/>
+        </w:rPr>
+      </w:pPr>
+    </w:p>
+    <w:p>
+      <w:pPr>
+        <w:rPr>
+          <w:rFonts w:ascii="Times New Roman" w:hAnsi="Times New Roman" w:cs="Times New Roman"/>
+          <w:sz w:val="28"/>
+          <w:szCs w:val="28"/>
+        </w:rPr>
+      </w:pPr>
+      <w:r>
+        <w:rPr>
+          <w:noProof/>
+        </w:rPr>
+        <w:lastRenderedPageBreak/>
         <w:drawing>
-          <wp:inline distT="0" distB="0" distL="0" distR="0">
+          <wp:inline distT="0" distB="0" distL="0" distR="0" wp14:anchorId="3A399F98" wp14:editId="4FAC4B42">
             <wp:extent cx="5934075" cy="3752850"/>
             <wp:effectExtent l="0" t="0" r="0" b="0"/>
             <wp:docPr id="8" name="Рисунок 8"/>
@@ -670,7 +679,7 @@
                     </pic:cNvPicPr>
                   </pic:nvPicPr>
                   <pic:blipFill>
-                    <a:blip r:embed="rId9"/>
+                    <a:blip r:embed="rId12"/>
                     <a:stretch>
                       <a:fillRect/>
                     </a:stretch>
@@ -694,16 +703,15 @@
     </w:p>
     <w:p>
       <w:pPr>
-        <w:pStyle w:val="Normal"/>
-        <w:rPr>
-          <w:rFonts w:ascii="Times New Roman" w:hAnsi="Times New Roman" w:cs="Times New Roman"/>
-          <w:sz w:val="28"/>
-          <w:szCs w:val="28"/>
-        </w:rPr>
-      </w:pPr>
-      <w:r>
-        <w:rPr>
-          <w:rFonts w:cs="Times New Roman" w:ascii="Times New Roman" w:hAnsi="Times New Roman"/>
+        <w:rPr>
+          <w:rFonts w:ascii="Times New Roman" w:hAnsi="Times New Roman" w:cs="Times New Roman"/>
+          <w:sz w:val="28"/>
+          <w:szCs w:val="28"/>
+        </w:rPr>
+      </w:pPr>
+      <w:r>
+        <w:rPr>
+          <w:rFonts w:ascii="Times New Roman" w:hAnsi="Times New Roman" w:cs="Times New Roman"/>
           <w:sz w:val="28"/>
           <w:szCs w:val="28"/>
         </w:rPr>
@@ -712,17 +720,18 @@
     </w:p>
     <w:p>
       <w:pPr>
-        <w:pStyle w:val="Normal"/>
-        <w:rPr>
-          <w:rFonts w:ascii="Times New Roman" w:hAnsi="Times New Roman" w:cs="Times New Roman"/>
-          <w:sz w:val="28"/>
-          <w:szCs w:val="28"/>
-        </w:rPr>
-      </w:pPr>
-      <w:r>
-        <w:rPr/>
+        <w:rPr>
+          <w:rFonts w:ascii="Times New Roman" w:hAnsi="Times New Roman" w:cs="Times New Roman"/>
+          <w:sz w:val="28"/>
+          <w:szCs w:val="28"/>
+        </w:rPr>
+      </w:pPr>
+      <w:r>
+        <w:rPr>
+          <w:noProof/>
+        </w:rPr>
         <w:drawing>
-          <wp:inline distT="0" distB="0" distL="0" distR="0">
+          <wp:inline distT="0" distB="0" distL="0" distR="0" wp14:anchorId="1FCFEFEE" wp14:editId="073445D8">
             <wp:extent cx="5895975" cy="3124200"/>
             <wp:effectExtent l="0" t="0" r="0" b="0"/>
             <wp:docPr id="9" name="Рисунок 9"/>
@@ -739,7 +748,7 @@
                     </pic:cNvPicPr>
                   </pic:nvPicPr>
                   <pic:blipFill>
-                    <a:blip r:embed="rId10"/>
+                    <a:blip r:embed="rId13"/>
                     <a:stretch>
                       <a:fillRect/>
                     </a:stretch>
@@ -763,7 +772,7 @@
     </w:p>
     <w:p>
       <w:pPr>
-        <w:pStyle w:val="ListParagraph"/>
+        <w:pStyle w:val="af0"/>
         <w:numPr>
           <w:ilvl w:val="0"/>
           <w:numId w:val="1"/>
@@ -776,7 +785,7 @@
       </w:pPr>
       <w:r>
         <w:rPr>
-          <w:rFonts w:cs="Times New Roman" w:ascii="Times New Roman" w:hAnsi="Times New Roman"/>
+          <w:rFonts w:ascii="Times New Roman" w:hAnsi="Times New Roman" w:cs="Times New Roman"/>
           <w:sz w:val="28"/>
           <w:szCs w:val="28"/>
         </w:rPr>
@@ -785,16 +794,16 @@
     </w:p>
     <w:p>
       <w:pPr>
-        <w:pStyle w:val="ListParagraph"/>
-        <w:rPr>
-          <w:rFonts w:ascii="Times New Roman" w:hAnsi="Times New Roman" w:cs="Times New Roman"/>
-          <w:sz w:val="28"/>
-          <w:szCs w:val="28"/>
-        </w:rPr>
-      </w:pPr>
-      <w:r>
-        <w:rPr>
-          <w:rFonts w:cs="Times New Roman" w:ascii="Times New Roman" w:hAnsi="Times New Roman"/>
+        <w:pStyle w:val="af0"/>
+        <w:rPr>
+          <w:rFonts w:ascii="Times New Roman" w:hAnsi="Times New Roman" w:cs="Times New Roman"/>
+          <w:sz w:val="28"/>
+          <w:szCs w:val="28"/>
+        </w:rPr>
+      </w:pPr>
+      <w:r>
+        <w:rPr>
+          <w:rFonts w:ascii="Times New Roman" w:hAnsi="Times New Roman" w:cs="Times New Roman"/>
           <w:sz w:val="28"/>
           <w:szCs w:val="28"/>
         </w:rPr>
@@ -803,17 +812,20 @@
     </w:p>
     <w:p>
       <w:pPr>
-        <w:pStyle w:val="ListParagraph"/>
-        <w:rPr>
-          <w:rFonts w:ascii="Times New Roman" w:hAnsi="Times New Roman" w:cs="Times New Roman"/>
-          <w:sz w:val="28"/>
-          <w:szCs w:val="28"/>
-        </w:rPr>
-      </w:pPr>
-      <w:r>
-        <w:rPr/>
+        <w:pStyle w:val="af0"/>
+        <w:rPr>
+          <w:rFonts w:ascii="Times New Roman" w:hAnsi="Times New Roman" w:cs="Times New Roman"/>
+          <w:sz w:val="28"/>
+          <w:szCs w:val="28"/>
+        </w:rPr>
+      </w:pPr>
+      <w:r>
+        <w:rPr>
+          <w:noProof/>
+        </w:rPr>
+        <w:lastRenderedPageBreak/>
         <w:drawing>
-          <wp:inline distT="0" distB="0" distL="0" distR="0">
+          <wp:inline distT="0" distB="0" distL="0" distR="0" wp14:anchorId="7B6834C6" wp14:editId="67BD90CE">
             <wp:extent cx="5934075" cy="2533650"/>
             <wp:effectExtent l="0" t="0" r="0" b="0"/>
             <wp:docPr id="10" name="Рисунок 10"/>
@@ -830,7 +842,7 @@
                     </pic:cNvPicPr>
                   </pic:nvPicPr>
                   <pic:blipFill>
-                    <a:blip r:embed="rId11"/>
+                    <a:blip r:embed="rId14"/>
                     <a:stretch>
                       <a:fillRect/>
                     </a:stretch>
@@ -854,42 +866,35 @@
     </w:p>
     <w:p>
       <w:pPr>
-        <w:pStyle w:val="Normal"/>
-        <w:rPr>
-          <w:rFonts w:ascii="Times New Roman" w:hAnsi="Times New Roman" w:cs="Times New Roman"/>
-          <w:sz w:val="28"/>
-          <w:szCs w:val="28"/>
-        </w:rPr>
-      </w:pPr>
-      <w:r>
-        <w:rPr>
-          <w:rFonts w:cs="Times New Roman" w:ascii="Times New Roman" w:hAnsi="Times New Roman"/>
-          <w:sz w:val="28"/>
-          <w:szCs w:val="28"/>
-        </w:rPr>
-      </w:r>
-    </w:p>
-    <w:p>
-      <w:pPr>
-        <w:pStyle w:val="Normal"/>
-        <w:rPr>
-          <w:rFonts w:ascii="Times New Roman" w:hAnsi="Times New Roman" w:cs="Times New Roman"/>
-          <w:sz w:val="28"/>
-          <w:szCs w:val="28"/>
-        </w:rPr>
-      </w:pPr>
-      <w:r>
-        <w:rPr>
-          <w:rFonts w:cs="Times New Roman" w:ascii="Times New Roman" w:hAnsi="Times New Roman"/>
+        <w:rPr>
+          <w:rFonts w:ascii="Times New Roman" w:hAnsi="Times New Roman" w:cs="Times New Roman"/>
+          <w:sz w:val="28"/>
+          <w:szCs w:val="28"/>
+        </w:rPr>
+      </w:pPr>
+    </w:p>
+    <w:p>
+      <w:pPr>
+        <w:rPr>
+          <w:rFonts w:ascii="Times New Roman" w:hAnsi="Times New Roman" w:cs="Times New Roman"/>
+          <w:sz w:val="28"/>
+          <w:szCs w:val="28"/>
+        </w:rPr>
+      </w:pPr>
+      <w:r>
+        <w:rPr>
+          <w:rFonts w:ascii="Times New Roman" w:hAnsi="Times New Roman" w:cs="Times New Roman"/>
           <w:sz w:val="28"/>
           <w:szCs w:val="28"/>
         </w:rPr>
         <w:t>Для этого надо нажать на имя БД и выбрать команду Загрузить резервную копию.</w:t>
       </w:r>
       <w:r>
-        <w:rPr/>
+        <w:rPr>
+          <w:noProof/>
+        </w:rPr>
         <w:drawing>
-          <wp:inline distT="0" distB="0" distL="0" distR="0">
+          <wp:inline distT="0" distB="0" distL="0" distR="0" wp14:anchorId="6E6918DB" wp14:editId="50EB8A96">
             <wp:extent cx="5940425" cy="3341370"/>
             <wp:effectExtent l="0" t="0" r="0" b="0"/>
             <wp:docPr id="11" name="Image2" descr="Изображение выглядит как текст, снимок экрана, программное обеспечение, Значок на компьютере&#10;&#10;Автоматически созданное описание"/>
@@ -906,7 +911,7 @@
                     </pic:cNvPicPr>
                   </pic:nvPicPr>
                   <pic:blipFill>
-                    <a:blip r:embed="rId12"/>
+                    <a:blip r:embed="rId15"/>
                     <a:stretch>
                       <a:fillRect/>
                     </a:stretch>
@@ -930,7 +935,7 @@
     </w:p>
     <w:p>
       <w:pPr>
-        <w:pStyle w:val="ListParagraph"/>
+        <w:pStyle w:val="af0"/>
         <w:numPr>
           <w:ilvl w:val="0"/>
           <w:numId w:val="1"/>
@@ -943,7 +948,7 @@
       </w:pPr>
       <w:r>
         <w:rPr>
-          <w:rFonts w:cs="Times New Roman" w:ascii="Times New Roman" w:hAnsi="Times New Roman"/>
+          <w:rFonts w:ascii="Times New Roman" w:hAnsi="Times New Roman" w:cs="Times New Roman"/>
           <w:sz w:val="28"/>
           <w:szCs w:val="28"/>
         </w:rPr>
@@ -952,17 +957,19 @@
     </w:p>
     <w:p>
       <w:pPr>
-        <w:pStyle w:val="Normal"/>
-        <w:rPr>
-          <w:rFonts w:ascii="Times New Roman" w:hAnsi="Times New Roman" w:cs="Times New Roman"/>
-          <w:sz w:val="28"/>
-          <w:szCs w:val="28"/>
-        </w:rPr>
-      </w:pPr>
-      <w:r>
-        <w:rPr/>
+        <w:rPr>
+          <w:rFonts w:ascii="Times New Roman" w:hAnsi="Times New Roman" w:cs="Times New Roman"/>
+          <w:sz w:val="28"/>
+          <w:szCs w:val="28"/>
+        </w:rPr>
+      </w:pPr>
+      <w:r>
+        <w:rPr>
+          <w:noProof/>
+        </w:rPr>
+        <w:lastRenderedPageBreak/>
         <w:drawing>
-          <wp:inline distT="0" distB="0" distL="0" distR="0">
+          <wp:inline distT="0" distB="0" distL="0" distR="0" wp14:anchorId="77306E3C" wp14:editId="1801FA85">
             <wp:extent cx="5940425" cy="3341370"/>
             <wp:effectExtent l="0" t="0" r="0" b="0"/>
             <wp:docPr id="12" name="Image3" descr="Изображение выглядит как текст, снимок экрана, программное обеспечение, Значок на компьютере&#10;&#10;Автоматически созданное описание"/>
@@ -974,323 +981,6 @@
                 <pic:pic xmlns:pic="http://schemas.openxmlformats.org/drawingml/2006/picture">
                   <pic:nvPicPr>
                     <pic:cNvPr id="12" name="Image3" descr="Изображение выглядит как текст, снимок экрана, программное обеспечение, Значок на компьютере&#10;&#10;Автоматически созданное описание"/>
-                    <pic:cNvPicPr>
-                      <a:picLocks noChangeAspect="1" noChangeArrowheads="1"/>
-                    </pic:cNvPicPr>
-                  </pic:nvPicPr>
-                  <pic:blipFill>
-                    <a:blip r:embed="rId13"/>
-                    <a:stretch>
-                      <a:fillRect/>
-                    </a:stretch>
-                  </pic:blipFill>
-                  <pic:spPr bwMode="auto">
-                    <a:xfrm>
-                      <a:off x="0" y="0"/>
-                      <a:ext cx="5940425" cy="3341370"/>
-                    </a:xfrm>
-                    <a:prstGeom prst="rect">
-                      <a:avLst/>
-                    </a:prstGeom>
-                    <a:noFill/>
-                  </pic:spPr>
-                </pic:pic>
-              </a:graphicData>
-            </a:graphic>
-          </wp:inline>
-        </w:drawing>
-      </w:r>
-    </w:p>
-    <w:p>
-      <w:pPr>
-        <w:pStyle w:val="ListParagraph"/>
-        <w:numPr>
-          <w:ilvl w:val="0"/>
-          <w:numId w:val="1"/>
-        </w:numPr>
-        <w:rPr>
-          <w:rFonts w:ascii="Times New Roman" w:hAnsi="Times New Roman" w:cs="Times New Roman"/>
-          <w:sz w:val="28"/>
-          <w:szCs w:val="28"/>
-        </w:rPr>
-      </w:pPr>
-      <w:r>
-        <w:rPr>
-          <w:rFonts w:cs="Times New Roman" w:ascii="Times New Roman" w:hAnsi="Times New Roman"/>
-          <w:sz w:val="28"/>
-          <w:szCs w:val="28"/>
-        </w:rPr>
-        <w:t>Для удаленного подключения к восстановленной базе данных необходимо определить I</w:t>
-      </w:r>
-      <w:r>
-        <w:rPr>
-          <w:rFonts w:cs="Times New Roman" w:ascii="Times New Roman" w:hAnsi="Times New Roman"/>
-          <w:sz w:val="28"/>
-          <w:szCs w:val="28"/>
-          <w:lang w:val="en-US"/>
-        </w:rPr>
-        <w:t>P</w:t>
-      </w:r>
-      <w:r>
-        <w:rPr>
-          <w:rFonts w:cs="Times New Roman" w:ascii="Times New Roman" w:hAnsi="Times New Roman"/>
-          <w:sz w:val="28"/>
-          <w:szCs w:val="28"/>
-        </w:rPr>
-        <w:t xml:space="preserve">-адрес. В меню базы данных выбрать пункт Доступ по </w:t>
-      </w:r>
-      <w:r>
-        <w:rPr>
-          <w:rFonts w:cs="Times New Roman" w:ascii="Times New Roman" w:hAnsi="Times New Roman"/>
-          <w:sz w:val="28"/>
-          <w:szCs w:val="28"/>
-          <w:lang w:val="en-US"/>
-        </w:rPr>
-        <w:t>IP</w:t>
-        <w:br/>
-      </w:r>
-      <w:r>
-        <w:rPr/>
-        <w:drawing>
-          <wp:inline distT="0" distB="0" distL="0" distR="0">
-            <wp:extent cx="5937250" cy="2406650"/>
-            <wp:effectExtent l="0" t="0" r="0" b="0"/>
-            <wp:docPr id="13" name="Image4"/>
-            <wp:cNvGraphicFramePr>
-              <a:graphicFrameLocks xmlns:a="http://schemas.openxmlformats.org/drawingml/2006/main" noChangeAspect="1"/>
-            </wp:cNvGraphicFramePr>
-            <a:graphic xmlns:a="http://schemas.openxmlformats.org/drawingml/2006/main">
-              <a:graphicData uri="http://schemas.openxmlformats.org/drawingml/2006/picture">
-                <pic:pic xmlns:pic="http://schemas.openxmlformats.org/drawingml/2006/picture">
-                  <pic:nvPicPr>
-                    <pic:cNvPr id="13" name="Image4"/>
-                    <pic:cNvPicPr>
-                      <a:picLocks noChangeAspect="1" noChangeArrowheads="1"/>
-                    </pic:cNvPicPr>
-                  </pic:nvPicPr>
-                  <pic:blipFill>
-                    <a:blip r:embed="rId14"/>
-                    <a:stretch>
-                      <a:fillRect/>
-                    </a:stretch>
-                  </pic:blipFill>
-                  <pic:spPr bwMode="auto">
-                    <a:xfrm>
-                      <a:off x="0" y="0"/>
-                      <a:ext cx="5937250" cy="2406650"/>
-                    </a:xfrm>
-                    <a:prstGeom prst="rect">
-                      <a:avLst/>
-                    </a:prstGeom>
-                    <a:noFill/>
-                  </pic:spPr>
-                </pic:pic>
-              </a:graphicData>
-            </a:graphic>
-          </wp:inline>
-        </w:drawing>
-      </w:r>
-    </w:p>
-    <w:p>
-      <w:pPr>
-        <w:pStyle w:val="ListParagraph"/>
-        <w:rPr>
-          <w:rFonts w:ascii="Times New Roman" w:hAnsi="Times New Roman" w:cs="Times New Roman"/>
-          <w:sz w:val="28"/>
-          <w:szCs w:val="28"/>
-        </w:rPr>
-      </w:pPr>
-      <w:r>
-        <w:rPr>
-          <w:rFonts w:cs="Times New Roman" w:ascii="Times New Roman" w:hAnsi="Times New Roman"/>
-          <w:sz w:val="28"/>
-          <w:szCs w:val="28"/>
-        </w:rPr>
-      </w:r>
-    </w:p>
-    <w:p>
-      <w:pPr>
-        <w:pStyle w:val="ListParagraph"/>
-        <w:numPr>
-          <w:ilvl w:val="0"/>
-          <w:numId w:val="1"/>
-        </w:numPr>
-        <w:rPr>
-          <w:rFonts w:ascii="Times New Roman" w:hAnsi="Times New Roman" w:cs="Times New Roman"/>
-          <w:sz w:val="28"/>
-          <w:szCs w:val="28"/>
-        </w:rPr>
-      </w:pPr>
-      <w:r>
-        <w:rPr>
-          <w:rFonts w:cs="Times New Roman" w:ascii="Times New Roman" w:hAnsi="Times New Roman"/>
-          <w:sz w:val="28"/>
-          <w:szCs w:val="28"/>
-        </w:rPr>
-        <w:t xml:space="preserve">Разрешить доступ </w:t>
-      </w:r>
-      <w:r>
-        <w:rPr>
-          <w:rFonts w:cs="Times New Roman" w:ascii="Times New Roman" w:hAnsi="Times New Roman"/>
-          <w:sz w:val="28"/>
-          <w:szCs w:val="28"/>
-          <w:lang w:val="en-US"/>
-        </w:rPr>
-        <w:t>c</w:t>
-      </w:r>
-      <w:r>
-        <w:rPr>
-          <w:rFonts w:cs="Times New Roman" w:ascii="Times New Roman" w:hAnsi="Times New Roman"/>
-          <w:sz w:val="28"/>
-          <w:szCs w:val="28"/>
-        </w:rPr>
-        <w:t xml:space="preserve"> любого </w:t>
-      </w:r>
-      <w:r>
-        <w:rPr>
-          <w:rFonts w:cs="Times New Roman" w:ascii="Times New Roman" w:hAnsi="Times New Roman"/>
-          <w:sz w:val="28"/>
-          <w:szCs w:val="28"/>
-          <w:lang w:val="en-US"/>
-        </w:rPr>
-        <w:t>IP</w:t>
-      </w:r>
-      <w:r>
-        <w:rPr>
-          <w:rFonts w:cs="Times New Roman" w:ascii="Times New Roman" w:hAnsi="Times New Roman"/>
-          <w:sz w:val="28"/>
-          <w:szCs w:val="28"/>
-        </w:rPr>
-        <w:t xml:space="preserve"> адреса</w:t>
-      </w:r>
-    </w:p>
-    <w:p>
-      <w:pPr>
-        <w:pStyle w:val="ListParagraph"/>
-        <w:rPr>
-          <w:rFonts w:ascii="Times New Roman" w:hAnsi="Times New Roman" w:cs="Times New Roman"/>
-          <w:sz w:val="28"/>
-          <w:szCs w:val="28"/>
-        </w:rPr>
-      </w:pPr>
-      <w:r>
-        <w:rPr>
-          <w:rFonts w:cs="Times New Roman" w:ascii="Times New Roman" w:hAnsi="Times New Roman"/>
-          <w:sz w:val="28"/>
-          <w:szCs w:val="28"/>
-        </w:rPr>
-      </w:r>
-    </w:p>
-    <w:p>
-      <w:pPr>
-        <w:pStyle w:val="ListParagraph"/>
-        <w:numPr>
-          <w:ilvl w:val="0"/>
-          <w:numId w:val="1"/>
-        </w:numPr>
-        <w:rPr>
-          <w:rFonts w:ascii="Times New Roman" w:hAnsi="Times New Roman" w:cs="Times New Roman"/>
-          <w:sz w:val="28"/>
-          <w:szCs w:val="28"/>
-        </w:rPr>
-      </w:pPr>
-      <w:r>
-        <w:rPr/>
-        <w:drawing>
-          <wp:inline distT="0" distB="0" distL="0" distR="0">
-            <wp:extent cx="6285865" cy="1871345"/>
-            <wp:effectExtent l="0" t="0" r="0" b="0"/>
-            <wp:docPr id="14" name="Рисунок 11"/>
-            <wp:cNvGraphicFramePr>
-              <a:graphicFrameLocks xmlns:a="http://schemas.openxmlformats.org/drawingml/2006/main" noChangeAspect="1"/>
-            </wp:cNvGraphicFramePr>
-            <a:graphic xmlns:a="http://schemas.openxmlformats.org/drawingml/2006/main">
-              <a:graphicData uri="http://schemas.openxmlformats.org/drawingml/2006/picture">
-                <pic:pic xmlns:pic="http://schemas.openxmlformats.org/drawingml/2006/picture">
-                  <pic:nvPicPr>
-                    <pic:cNvPr id="14" name="Рисунок 11"/>
-                    <pic:cNvPicPr>
-                      <a:picLocks noChangeAspect="1" noChangeArrowheads="1"/>
-                    </pic:cNvPicPr>
-                  </pic:nvPicPr>
-                  <pic:blipFill>
-                    <a:blip r:embed="rId15"/>
-                    <a:stretch>
-                      <a:fillRect/>
-                    </a:stretch>
-                  </pic:blipFill>
-                  <pic:spPr bwMode="auto">
-                    <a:xfrm>
-                      <a:off x="0" y="0"/>
-                      <a:ext cx="6285865" cy="1871345"/>
-                    </a:xfrm>
-                    <a:prstGeom prst="rect">
-                      <a:avLst/>
-                    </a:prstGeom>
-                    <a:noFill/>
-                  </pic:spPr>
-                </pic:pic>
-              </a:graphicData>
-            </a:graphic>
-          </wp:inline>
-        </w:drawing>
-      </w:r>
-    </w:p>
-    <w:p>
-      <w:pPr>
-        <w:pStyle w:val="Normal"/>
-        <w:rPr>
-          <w:rFonts w:ascii="Times New Roman" w:hAnsi="Times New Roman" w:cs="Times New Roman"/>
-          <w:sz w:val="28"/>
-          <w:szCs w:val="28"/>
-          <w:lang w:val="en-US"/>
-        </w:rPr>
-      </w:pPr>
-      <w:r>
-        <w:rPr>
-          <w:rFonts w:cs="Times New Roman" w:ascii="Times New Roman" w:hAnsi="Times New Roman"/>
-          <w:sz w:val="28"/>
-          <w:szCs w:val="28"/>
-          <w:lang w:val="en-US"/>
-        </w:rPr>
-      </w:r>
-    </w:p>
-    <w:p>
-      <w:pPr>
-        <w:pStyle w:val="ListParagraph"/>
-        <w:numPr>
-          <w:ilvl w:val="0"/>
-          <w:numId w:val="1"/>
-        </w:numPr>
-        <w:rPr>
-          <w:rFonts w:ascii="Times New Roman" w:hAnsi="Times New Roman" w:cs="Times New Roman"/>
-          <w:sz w:val="28"/>
-          <w:szCs w:val="28"/>
-        </w:rPr>
-      </w:pPr>
-      <w:r>
-        <w:rPr>
-          <w:rFonts w:cs="Times New Roman" w:ascii="Times New Roman" w:hAnsi="Times New Roman"/>
-          <w:sz w:val="28"/>
-          <w:szCs w:val="28"/>
-        </w:rPr>
-        <w:t>Данный хостинг предоставляет Админ панель для взаимодействия с базой данных(phpMyAdmin).</w:t>
-      </w:r>
-      <w:r>
-        <w:rPr/>
-        <w:drawing>
-          <wp:inline distT="0" distB="0" distL="0" distR="0">
-            <wp:extent cx="5940425" cy="3341370"/>
-            <wp:effectExtent l="0" t="0" r="0" b="0"/>
-            <wp:docPr id="15" name="Image5" descr="Изображение выглядит как текст, снимок экрана, программное обеспечение, Значок на компьютере&#10;&#10;Автоматически созданное описание"/>
-            <wp:cNvGraphicFramePr>
-              <a:graphicFrameLocks xmlns:a="http://schemas.openxmlformats.org/drawingml/2006/main" noChangeAspect="1"/>
-            </wp:cNvGraphicFramePr>
-            <a:graphic xmlns:a="http://schemas.openxmlformats.org/drawingml/2006/main">
-              <a:graphicData uri="http://schemas.openxmlformats.org/drawingml/2006/picture">
-                <pic:pic xmlns:pic="http://schemas.openxmlformats.org/drawingml/2006/picture">
-                  <pic:nvPicPr>
-                    <pic:cNvPr id="15" name="Image5" descr="Изображение выглядит как текст, снимок экрана, программное обеспечение, Значок на компьютере&#10;&#10;Автоматически созданное описание"/>
                     <pic:cNvPicPr>
                       <a:picLocks noChangeAspect="1" noChangeArrowheads="1"/>
                     </pic:cNvPicPr>
@@ -1320,7 +1010,7 @@
     </w:p>
     <w:p>
       <w:pPr>
-        <w:pStyle w:val="ListParagraph"/>
+        <w:pStyle w:val="af0"/>
         <w:numPr>
           <w:ilvl w:val="0"/>
           <w:numId w:val="1"/>
@@ -1333,29 +1023,56 @@
       </w:pPr>
       <w:r>
         <w:rPr>
-          <w:rFonts w:cs="Times New Roman" w:ascii="Times New Roman" w:hAnsi="Times New Roman"/>
-          <w:sz w:val="28"/>
-          <w:szCs w:val="28"/>
-        </w:rPr>
-        <w:t>Перейдите в админ-панель и просмотрите таблицы.</w:t>
-      </w:r>
-    </w:p>
-    <w:p>
-      <w:pPr>
-        <w:pStyle w:val="Normal"/>
-        <w:rPr>
-          <w:rFonts w:ascii="Times New Roman" w:hAnsi="Times New Roman" w:cs="Times New Roman"/>
-          <w:sz w:val="28"/>
-          <w:szCs w:val="28"/>
-        </w:rPr>
-      </w:pPr>
-      <w:r>
-        <w:rPr/>
+          <w:rFonts w:ascii="Times New Roman" w:hAnsi="Times New Roman" w:cs="Times New Roman"/>
+          <w:sz w:val="28"/>
+          <w:szCs w:val="28"/>
+        </w:rPr>
+        <w:t>Для удаленного подключения к восстановленной базе данных необходимо определить I</w:t>
+      </w:r>
+      <w:r>
+        <w:rPr>
+          <w:rFonts w:ascii="Times New Roman" w:hAnsi="Times New Roman" w:cs="Times New Roman"/>
+          <w:sz w:val="28"/>
+          <w:szCs w:val="28"/>
+          <w:lang w:val="en-US"/>
+        </w:rPr>
+        <w:t>P</w:t>
+      </w:r>
+      <w:r>
+        <w:rPr>
+          <w:rFonts w:ascii="Times New Roman" w:hAnsi="Times New Roman" w:cs="Times New Roman"/>
+          <w:sz w:val="28"/>
+          <w:szCs w:val="28"/>
+        </w:rPr>
+        <w:t xml:space="preserve">-адрес. В меню базы данных выбрать пункт Доступ по </w:t>
+      </w:r>
+      <w:r>
+        <w:rPr>
+          <w:rFonts w:ascii="Times New Roman" w:hAnsi="Times New Roman" w:cs="Times New Roman"/>
+          <w:sz w:val="28"/>
+          <w:szCs w:val="28"/>
+          <w:lang w:val="en-US"/>
+        </w:rPr>
+        <w:t>IP</w:t>
+      </w:r>
+      <w:r>
+        <w:rPr>
+          <w:rFonts w:ascii="Times New Roman" w:hAnsi="Times New Roman" w:cs="Times New Roman"/>
+          <w:sz w:val="28"/>
+          <w:szCs w:val="28"/>
+          <w:lang w:val="en-US"/>
+        </w:rPr>
+        <w:br/>
+      </w:r>
+      <w:r>
+        <w:rPr>
+          <w:noProof/>
+        </w:rPr>
         <w:drawing>
-          <wp:inline distT="0" distB="0" distL="0" distR="0">
-            <wp:extent cx="5940425" cy="3341370"/>
+          <wp:inline distT="0" distB="0" distL="0" distR="0" wp14:anchorId="1EF48A93" wp14:editId="2674DD1B">
+            <wp:extent cx="5937250" cy="2406650"/>
             <wp:effectExtent l="0" t="0" r="0" b="0"/>
-            <wp:docPr id="16" name="Image6" descr="Изображение выглядит как текст, снимок экрана, программное обеспечение, Значок на компьютере&#10;&#10;Автоматически созданное описание"/>
+            <wp:docPr id="13" name="Image4"/>
             <wp:cNvGraphicFramePr>
               <a:graphicFrameLocks xmlns:a="http://schemas.openxmlformats.org/drawingml/2006/main" noChangeAspect="1"/>
             </wp:cNvGraphicFramePr>
@@ -1363,13 +1080,240 @@
               <a:graphicData uri="http://schemas.openxmlformats.org/drawingml/2006/picture">
                 <pic:pic xmlns:pic="http://schemas.openxmlformats.org/drawingml/2006/picture">
                   <pic:nvPicPr>
-                    <pic:cNvPr id="16" name="Image6" descr="Изображение выглядит как текст, снимок экрана, программное обеспечение, Значок на компьютере&#10;&#10;Автоматически созданное описание"/>
+                    <pic:cNvPr id="13" name="Image4"/>
                     <pic:cNvPicPr>
                       <a:picLocks noChangeAspect="1" noChangeArrowheads="1"/>
                     </pic:cNvPicPr>
                   </pic:nvPicPr>
                   <pic:blipFill>
                     <a:blip r:embed="rId17"/>
+                    <a:stretch>
+                      <a:fillRect/>
+                    </a:stretch>
+                  </pic:blipFill>
+                  <pic:spPr bwMode="auto">
+                    <a:xfrm>
+                      <a:off x="0" y="0"/>
+                      <a:ext cx="5937250" cy="2406650"/>
+                    </a:xfrm>
+                    <a:prstGeom prst="rect">
+                      <a:avLst/>
+                    </a:prstGeom>
+                    <a:noFill/>
+                  </pic:spPr>
+                </pic:pic>
+              </a:graphicData>
+            </a:graphic>
+          </wp:inline>
+        </w:drawing>
+      </w:r>
+    </w:p>
+    <w:p>
+      <w:pPr>
+        <w:pStyle w:val="af0"/>
+        <w:rPr>
+          <w:rFonts w:ascii="Times New Roman" w:hAnsi="Times New Roman" w:cs="Times New Roman"/>
+          <w:sz w:val="28"/>
+          <w:szCs w:val="28"/>
+        </w:rPr>
+      </w:pPr>
+    </w:p>
+    <w:p>
+      <w:pPr>
+        <w:pStyle w:val="af0"/>
+        <w:numPr>
+          <w:ilvl w:val="0"/>
+          <w:numId w:val="1"/>
+        </w:numPr>
+        <w:rPr>
+          <w:rFonts w:ascii="Times New Roman" w:hAnsi="Times New Roman" w:cs="Times New Roman"/>
+          <w:sz w:val="28"/>
+          <w:szCs w:val="28"/>
+        </w:rPr>
+      </w:pPr>
+      <w:r>
+        <w:rPr>
+          <w:rFonts w:ascii="Times New Roman" w:hAnsi="Times New Roman" w:cs="Times New Roman"/>
+          <w:sz w:val="28"/>
+          <w:szCs w:val="28"/>
+        </w:rPr>
+        <w:t xml:space="preserve">Разрешить доступ </w:t>
+      </w:r>
+      <w:r>
+        <w:rPr>
+          <w:rFonts w:ascii="Times New Roman" w:hAnsi="Times New Roman" w:cs="Times New Roman"/>
+          <w:sz w:val="28"/>
+          <w:szCs w:val="28"/>
+          <w:lang w:val="en-US"/>
+        </w:rPr>
+        <w:t>c</w:t>
+      </w:r>
+      <w:r>
+        <w:rPr>
+          <w:rFonts w:ascii="Times New Roman" w:hAnsi="Times New Roman" w:cs="Times New Roman"/>
+          <w:sz w:val="28"/>
+          <w:szCs w:val="28"/>
+        </w:rPr>
+        <w:t xml:space="preserve"> любого </w:t>
+      </w:r>
+      <w:r>
+        <w:rPr>
+          <w:rFonts w:ascii="Times New Roman" w:hAnsi="Times New Roman" w:cs="Times New Roman"/>
+          <w:sz w:val="28"/>
+          <w:szCs w:val="28"/>
+          <w:lang w:val="en-US"/>
+        </w:rPr>
+        <w:t>IP</w:t>
+      </w:r>
+      <w:r>
+        <w:rPr>
+          <w:rFonts w:ascii="Times New Roman" w:hAnsi="Times New Roman" w:cs="Times New Roman"/>
+          <w:sz w:val="28"/>
+          <w:szCs w:val="28"/>
+        </w:rPr>
+        <w:t xml:space="preserve"> адреса</w:t>
+      </w:r>
+    </w:p>
+    <w:p>
+      <w:pPr>
+        <w:pStyle w:val="af0"/>
+        <w:rPr>
+          <w:rFonts w:ascii="Times New Roman" w:hAnsi="Times New Roman" w:cs="Times New Roman"/>
+          <w:sz w:val="28"/>
+          <w:szCs w:val="28"/>
+        </w:rPr>
+      </w:pPr>
+    </w:p>
+    <w:p>
+      <w:pPr>
+        <w:pStyle w:val="af0"/>
+        <w:numPr>
+          <w:ilvl w:val="0"/>
+          <w:numId w:val="1"/>
+        </w:numPr>
+        <w:rPr>
+          <w:rFonts w:ascii="Times New Roman" w:hAnsi="Times New Roman" w:cs="Times New Roman"/>
+          <w:sz w:val="28"/>
+          <w:szCs w:val="28"/>
+        </w:rPr>
+      </w:pPr>
+      <w:r>
+        <w:rPr>
+          <w:noProof/>
+        </w:rPr>
+        <w:drawing>
+          <wp:inline distT="0" distB="0" distL="0" distR="0" wp14:anchorId="6C531505" wp14:editId="4A5A5435">
+            <wp:extent cx="6285865" cy="1871345"/>
+            <wp:effectExtent l="0" t="0" r="0" b="0"/>
+            <wp:docPr id="14" name="Рисунок 11"/>
+            <wp:cNvGraphicFramePr>
+              <a:graphicFrameLocks xmlns:a="http://schemas.openxmlformats.org/drawingml/2006/main" noChangeAspect="1"/>
+            </wp:cNvGraphicFramePr>
+            <a:graphic xmlns:a="http://schemas.openxmlformats.org/drawingml/2006/main">
+              <a:graphicData uri="http://schemas.openxmlformats.org/drawingml/2006/picture">
+                <pic:pic xmlns:pic="http://schemas.openxmlformats.org/drawingml/2006/picture">
+                  <pic:nvPicPr>
+                    <pic:cNvPr id="14" name="Рисунок 11"/>
+                    <pic:cNvPicPr>
+                      <a:picLocks noChangeAspect="1" noChangeArrowheads="1"/>
+                    </pic:cNvPicPr>
+                  </pic:nvPicPr>
+                  <pic:blipFill>
+                    <a:blip r:embed="rId18"/>
+                    <a:stretch>
+                      <a:fillRect/>
+                    </a:stretch>
+                  </pic:blipFill>
+                  <pic:spPr bwMode="auto">
+                    <a:xfrm>
+                      <a:off x="0" y="0"/>
+                      <a:ext cx="6285865" cy="1871345"/>
+                    </a:xfrm>
+                    <a:prstGeom prst="rect">
+                      <a:avLst/>
+                    </a:prstGeom>
+                    <a:noFill/>
+                  </pic:spPr>
+                </pic:pic>
+              </a:graphicData>
+            </a:graphic>
+          </wp:inline>
+        </w:drawing>
+      </w:r>
+    </w:p>
+    <w:p>
+      <w:pPr>
+        <w:rPr>
+          <w:rFonts w:ascii="Times New Roman" w:hAnsi="Times New Roman" w:cs="Times New Roman"/>
+          <w:sz w:val="28"/>
+          <w:szCs w:val="28"/>
+          <w:lang w:val="en-US"/>
+        </w:rPr>
+      </w:pPr>
+    </w:p>
+    <w:p>
+      <w:pPr>
+        <w:pStyle w:val="af0"/>
+        <w:numPr>
+          <w:ilvl w:val="0"/>
+          <w:numId w:val="1"/>
+        </w:numPr>
+        <w:rPr>
+          <w:rFonts w:ascii="Times New Roman" w:hAnsi="Times New Roman" w:cs="Times New Roman"/>
+          <w:sz w:val="28"/>
+          <w:szCs w:val="28"/>
+        </w:rPr>
+      </w:pPr>
+      <w:r>
+        <w:rPr>
+          <w:rFonts w:ascii="Times New Roman" w:hAnsi="Times New Roman" w:cs="Times New Roman"/>
+          <w:sz w:val="28"/>
+          <w:szCs w:val="28"/>
+        </w:rPr>
+        <w:lastRenderedPageBreak/>
+        <w:t>Данный хостинг предоставляет Админ панель для взаимодействия с базой данных(</w:t>
+      </w:r>
+      <w:proofErr w:type="spellStart"/>
+      <w:r>
+        <w:rPr>
+          <w:rFonts w:ascii="Times New Roman" w:hAnsi="Times New Roman" w:cs="Times New Roman"/>
+          <w:sz w:val="28"/>
+          <w:szCs w:val="28"/>
+        </w:rPr>
+        <w:t>phpMyAdmin</w:t>
+      </w:r>
+      <w:proofErr w:type="spellEnd"/>
+      <w:r>
+        <w:rPr>
+          <w:rFonts w:ascii="Times New Roman" w:hAnsi="Times New Roman" w:cs="Times New Roman"/>
+          <w:sz w:val="28"/>
+          <w:szCs w:val="28"/>
+        </w:rPr>
+        <w:t>).</w:t>
+      </w:r>
+      <w:r>
+        <w:rPr>
+          <w:noProof/>
+        </w:rPr>
+        <w:drawing>
+          <wp:inline distT="0" distB="0" distL="0" distR="0" wp14:anchorId="065D449B" wp14:editId="431DAF7F">
+            <wp:extent cx="5940425" cy="3341370"/>
+            <wp:effectExtent l="0" t="0" r="0" b="0"/>
+            <wp:docPr id="15" name="Image5" descr="Изображение выглядит как текст, снимок экрана, программное обеспечение, Значок на компьютере&#10;&#10;Автоматически созданное описание"/>
+            <wp:cNvGraphicFramePr>
+              <a:graphicFrameLocks xmlns:a="http://schemas.openxmlformats.org/drawingml/2006/main" noChangeAspect="1"/>
+            </wp:cNvGraphicFramePr>
+            <a:graphic xmlns:a="http://schemas.openxmlformats.org/drawingml/2006/main">
+              <a:graphicData uri="http://schemas.openxmlformats.org/drawingml/2006/picture">
+                <pic:pic xmlns:pic="http://schemas.openxmlformats.org/drawingml/2006/picture">
+                  <pic:nvPicPr>
+                    <pic:cNvPr id="15" name="Image5" descr="Изображение выглядит как текст, снимок экрана, программное обеспечение, Значок на компьютере&#10;&#10;Автоматически созданное описание"/>
+                    <pic:cNvPicPr>
+                      <a:picLocks noChangeAspect="1" noChangeArrowheads="1"/>
+                    </pic:cNvPicPr>
+                  </pic:nvPicPr>
+                  <pic:blipFill>
+                    <a:blip r:embed="rId19"/>
                     <a:stretch>
                       <a:fillRect/>
                     </a:stretch>
@@ -1393,21 +1337,95 @@
     </w:p>
     <w:p>
       <w:pPr>
-        <w:pStyle w:val="ListParagraph"/>
+        <w:pStyle w:val="af0"/>
         <w:numPr>
           <w:ilvl w:val="0"/>
           <w:numId w:val="1"/>
         </w:numPr>
-        <w:ind w:hanging="360" w:start="360"/>
-        <w:rPr>
-          <w:rFonts w:ascii="Times New Roman" w:hAnsi="Times New Roman" w:cs="Times New Roman"/>
-          <w:sz w:val="28"/>
-          <w:szCs w:val="28"/>
-        </w:rPr>
-      </w:pPr>
-      <w:r>
-        <w:rPr>
-          <w:rFonts w:cs="Times New Roman" w:ascii="Times New Roman" w:hAnsi="Times New Roman"/>
+        <w:rPr>
+          <w:rFonts w:ascii="Times New Roman" w:hAnsi="Times New Roman" w:cs="Times New Roman"/>
+          <w:sz w:val="28"/>
+          <w:szCs w:val="28"/>
+        </w:rPr>
+      </w:pPr>
+      <w:r>
+        <w:rPr>
+          <w:rFonts w:ascii="Times New Roman" w:hAnsi="Times New Roman" w:cs="Times New Roman"/>
+          <w:sz w:val="28"/>
+          <w:szCs w:val="28"/>
+        </w:rPr>
+        <w:t>Перейдите в админ-панель и просмотрите таблицы.</w:t>
+      </w:r>
+    </w:p>
+    <w:p>
+      <w:pPr>
+        <w:rPr>
+          <w:rFonts w:ascii="Times New Roman" w:hAnsi="Times New Roman" w:cs="Times New Roman"/>
+          <w:sz w:val="28"/>
+          <w:szCs w:val="28"/>
+        </w:rPr>
+      </w:pPr>
+      <w:r>
+        <w:rPr>
+          <w:noProof/>
+        </w:rPr>
+        <w:drawing>
+          <wp:inline distT="0" distB="0" distL="0" distR="0" wp14:anchorId="64E27606" wp14:editId="5ED6AAAE">
+            <wp:extent cx="5940425" cy="3341370"/>
+            <wp:effectExtent l="0" t="0" r="0" b="0"/>
+            <wp:docPr id="16" name="Image6" descr="Изображение выглядит как текст, снимок экрана, программное обеспечение, Значок на компьютере&#10;&#10;Автоматически созданное описание"/>
+            <wp:cNvGraphicFramePr>
+              <a:graphicFrameLocks xmlns:a="http://schemas.openxmlformats.org/drawingml/2006/main" noChangeAspect="1"/>
+            </wp:cNvGraphicFramePr>
+            <a:graphic xmlns:a="http://schemas.openxmlformats.org/drawingml/2006/main">
+              <a:graphicData uri="http://schemas.openxmlformats.org/drawingml/2006/picture">
+                <pic:pic xmlns:pic="http://schemas.openxmlformats.org/drawingml/2006/picture">
+                  <pic:nvPicPr>
+                    <pic:cNvPr id="16" name="Image6" descr="Изображение выглядит как текст, снимок экрана, программное обеспечение, Значок на компьютере&#10;&#10;Автоматически созданное описание"/>
+                    <pic:cNvPicPr>
+                      <a:picLocks noChangeAspect="1" noChangeArrowheads="1"/>
+                    </pic:cNvPicPr>
+                  </pic:nvPicPr>
+                  <pic:blipFill>
+                    <a:blip r:embed="rId20"/>
+                    <a:stretch>
+                      <a:fillRect/>
+                    </a:stretch>
+                  </pic:blipFill>
+                  <pic:spPr bwMode="auto">
+                    <a:xfrm>
+                      <a:off x="0" y="0"/>
+                      <a:ext cx="5940425" cy="3341370"/>
+                    </a:xfrm>
+                    <a:prstGeom prst="rect">
+                      <a:avLst/>
+                    </a:prstGeom>
+                    <a:noFill/>
+                  </pic:spPr>
+                </pic:pic>
+              </a:graphicData>
+            </a:graphic>
+          </wp:inline>
+        </w:drawing>
+      </w:r>
+    </w:p>
+    <w:p>
+      <w:pPr>
+        <w:pStyle w:val="af0"/>
+        <w:numPr>
+          <w:ilvl w:val="0"/>
+          <w:numId w:val="1"/>
+        </w:numPr>
+        <w:ind w:left="360"/>
+        <w:rPr>
+          <w:rFonts w:ascii="Times New Roman" w:hAnsi="Times New Roman" w:cs="Times New Roman"/>
+          <w:sz w:val="28"/>
+          <w:szCs w:val="28"/>
+        </w:rPr>
+      </w:pPr>
+      <w:r>
+        <w:rPr>
+          <w:rFonts w:ascii="Times New Roman" w:hAnsi="Times New Roman" w:cs="Times New Roman"/>
           <w:sz w:val="28"/>
           <w:szCs w:val="28"/>
         </w:rPr>
@@ -1415,7 +1433,7 @@
       </w:r>
       <w:r>
         <w:rPr>
-          <w:rFonts w:cs="Times New Roman" w:ascii="Times New Roman" w:hAnsi="Times New Roman"/>
+          <w:rFonts w:ascii="Times New Roman" w:hAnsi="Times New Roman" w:cs="Times New Roman"/>
           <w:sz w:val="28"/>
           <w:szCs w:val="28"/>
           <w:lang w:val="en-US"/>
@@ -1424,26 +1442,44 @@
       </w:r>
       <w:r>
         <w:rPr>
-          <w:rFonts w:cs="Times New Roman" w:ascii="Times New Roman" w:hAnsi="Times New Roman"/>
-          <w:sz w:val="28"/>
-          <w:szCs w:val="28"/>
-        </w:rPr>
-        <w:t xml:space="preserve"> с помощью DBeaver. </w:t>
-      </w:r>
-    </w:p>
-    <w:p>
-      <w:pPr>
-        <w:pStyle w:val="ListParagraph"/>
-        <w:ind w:start="360"/>
-        <w:rPr>
-          <w:rFonts w:ascii="Times New Roman" w:hAnsi="Times New Roman" w:cs="Times New Roman"/>
-          <w:sz w:val="28"/>
-          <w:szCs w:val="28"/>
-        </w:rPr>
-      </w:pPr>
-      <w:r>
-        <w:rPr>
-          <w:rFonts w:cs="Times New Roman" w:ascii="Times New Roman" w:hAnsi="Times New Roman"/>
+          <w:rFonts w:ascii="Times New Roman" w:hAnsi="Times New Roman" w:cs="Times New Roman"/>
+          <w:sz w:val="28"/>
+          <w:szCs w:val="28"/>
+        </w:rPr>
+        <w:t xml:space="preserve"> с помощью </w:t>
+      </w:r>
+      <w:proofErr w:type="spellStart"/>
+      <w:r>
+        <w:rPr>
+          <w:rFonts w:ascii="Times New Roman" w:hAnsi="Times New Roman" w:cs="Times New Roman"/>
+          <w:sz w:val="28"/>
+          <w:szCs w:val="28"/>
+        </w:rPr>
+        <w:t>DBeaver</w:t>
+      </w:r>
+      <w:proofErr w:type="spellEnd"/>
+      <w:r>
+        <w:rPr>
+          <w:rFonts w:ascii="Times New Roman" w:hAnsi="Times New Roman" w:cs="Times New Roman"/>
+          <w:sz w:val="28"/>
+          <w:szCs w:val="28"/>
+        </w:rPr>
+        <w:t xml:space="preserve">. </w:t>
+      </w:r>
+    </w:p>
+    <w:p>
+      <w:pPr>
+        <w:pStyle w:val="af0"/>
+        <w:ind w:left="360"/>
+        <w:rPr>
+          <w:rFonts w:ascii="Times New Roman" w:hAnsi="Times New Roman" w:cs="Times New Roman"/>
+          <w:sz w:val="28"/>
+          <w:szCs w:val="28"/>
+        </w:rPr>
+      </w:pPr>
+      <w:r>
+        <w:rPr>
+          <w:rFonts w:ascii="Times New Roman" w:hAnsi="Times New Roman" w:cs="Times New Roman"/>
           <w:sz w:val="28"/>
           <w:szCs w:val="28"/>
         </w:rPr>
@@ -1451,7 +1487,7 @@
       </w:r>
       <w:r>
         <w:rPr>
-          <w:rFonts w:cs="Times New Roman" w:ascii="Times New Roman" w:hAnsi="Times New Roman"/>
+          <w:rFonts w:ascii="Times New Roman" w:hAnsi="Times New Roman" w:cs="Times New Roman"/>
           <w:sz w:val="28"/>
           <w:szCs w:val="28"/>
           <w:lang w:val="en-US"/>
@@ -1460,24 +1496,61 @@
       </w:r>
       <w:r>
         <w:rPr>
-          <w:rFonts w:cs="Times New Roman" w:ascii="Times New Roman" w:hAnsi="Times New Roman"/>
-          <w:sz w:val="28"/>
-          <w:szCs w:val="28"/>
-        </w:rPr>
-        <w:t>-адрес вашего аккаунта для удаленного доступа к вашей БД(Меню Домены-</w:t>
-      </w:r>
-      <w:r>
-        <w:rPr>
-          <w:rFonts w:cs="Times New Roman" w:ascii="Times New Roman" w:hAnsi="Times New Roman"/>
+          <w:rFonts w:ascii="Times New Roman" w:hAnsi="Times New Roman" w:cs="Times New Roman"/>
+          <w:sz w:val="28"/>
+          <w:szCs w:val="28"/>
+        </w:rPr>
+        <w:t xml:space="preserve">-адрес вашего аккаунта для удаленного доступа к вашей </w:t>
+      </w:r>
+      <w:proofErr w:type="gramStart"/>
+      <w:r>
+        <w:rPr>
+          <w:rFonts w:ascii="Times New Roman" w:hAnsi="Times New Roman" w:cs="Times New Roman"/>
+          <w:sz w:val="28"/>
+          <w:szCs w:val="28"/>
+        </w:rPr>
+        <w:t>БД(</w:t>
+      </w:r>
+      <w:proofErr w:type="gramEnd"/>
+      <w:r>
+        <w:rPr>
+          <w:rFonts w:ascii="Times New Roman" w:hAnsi="Times New Roman" w:cs="Times New Roman"/>
+          <w:sz w:val="28"/>
+          <w:szCs w:val="28"/>
+        </w:rPr>
+        <w:t>Меню Домены</w:t>
+      </w:r>
+      <w:proofErr w:type="gramStart"/>
+      <w:r>
+        <w:rPr>
+          <w:rFonts w:ascii="Times New Roman" w:hAnsi="Times New Roman" w:cs="Times New Roman"/>
+          <w:sz w:val="28"/>
+          <w:szCs w:val="28"/>
+        </w:rPr>
+        <w:t>-</w:t>
+      </w:r>
+      <w:r>
+        <w:rPr>
+          <w:rFonts w:ascii="Times New Roman" w:hAnsi="Times New Roman" w:cs="Times New Roman"/>
           <w:sz w:val="28"/>
           <w:szCs w:val="28"/>
           <w:lang w:val="en-US"/>
         </w:rPr>
-        <w:t>&gt;IP-</w:t>
-      </w:r>
-      <w:r>
-        <w:rPr>
-          <w:rFonts w:cs="Times New Roman" w:ascii="Times New Roman" w:hAnsi="Times New Roman"/>
+        <w:t>&gt;IP</w:t>
+      </w:r>
+      <w:proofErr w:type="gramEnd"/>
+      <w:r>
+        <w:rPr>
+          <w:rFonts w:ascii="Times New Roman" w:hAnsi="Times New Roman" w:cs="Times New Roman"/>
+          <w:sz w:val="28"/>
+          <w:szCs w:val="28"/>
+          <w:lang w:val="en-US"/>
+        </w:rPr>
+        <w:t>-</w:t>
+      </w:r>
+      <w:r>
+        <w:rPr>
+          <w:rFonts w:ascii="Times New Roman" w:hAnsi="Times New Roman" w:cs="Times New Roman"/>
           <w:sz w:val="28"/>
           <w:szCs w:val="28"/>
         </w:rPr>
@@ -1486,36 +1559,32 @@
     </w:p>
     <w:p>
       <w:pPr>
-        <w:pStyle w:val="ListParagraph"/>
-        <w:ind w:start="360"/>
-        <w:rPr>
-          <w:rFonts w:ascii="Times New Roman" w:hAnsi="Times New Roman" w:cs="Times New Roman"/>
-          <w:sz w:val="28"/>
-          <w:szCs w:val="28"/>
-        </w:rPr>
-      </w:pPr>
-      <w:r>
-        <w:rPr>
-          <w:rFonts w:cs="Times New Roman" w:ascii="Times New Roman" w:hAnsi="Times New Roman"/>
-          <w:sz w:val="28"/>
-          <w:szCs w:val="28"/>
-        </w:rPr>
-      </w:r>
-    </w:p>
-    <w:p>
-      <w:pPr>
-        <w:pStyle w:val="ListParagraph"/>
-        <w:ind w:start="360"/>
-        <w:rPr>
-          <w:rFonts w:ascii="Times New Roman" w:hAnsi="Times New Roman" w:cs="Times New Roman"/>
-          <w:sz w:val="28"/>
-          <w:szCs w:val="28"/>
-        </w:rPr>
-      </w:pPr>
-      <w:r>
-        <w:rPr/>
+        <w:pStyle w:val="af0"/>
+        <w:ind w:left="360"/>
+        <w:rPr>
+          <w:rFonts w:ascii="Times New Roman" w:hAnsi="Times New Roman" w:cs="Times New Roman"/>
+          <w:sz w:val="28"/>
+          <w:szCs w:val="28"/>
+        </w:rPr>
+      </w:pPr>
+    </w:p>
+    <w:p>
+      <w:pPr>
+        <w:pStyle w:val="af0"/>
+        <w:ind w:left="360"/>
+        <w:rPr>
+          <w:rFonts w:ascii="Times New Roman" w:hAnsi="Times New Roman" w:cs="Times New Roman"/>
+          <w:sz w:val="28"/>
+          <w:szCs w:val="28"/>
+        </w:rPr>
+      </w:pPr>
+      <w:r>
+        <w:rPr>
+          <w:noProof/>
+        </w:rPr>
+        <w:lastRenderedPageBreak/>
         <w:drawing>
-          <wp:inline distT="0" distB="0" distL="0" distR="0">
+          <wp:inline distT="0" distB="0" distL="0" distR="0" wp14:anchorId="6C5EC1A1" wp14:editId="0A373753">
             <wp:extent cx="5743575" cy="2844165"/>
             <wp:effectExtent l="0" t="0" r="0" b="0"/>
             <wp:docPr id="17" name="Рисунок 12"/>
@@ -1532,7 +1601,7 @@
                     </pic:cNvPicPr>
                   </pic:nvPicPr>
                   <pic:blipFill>
-                    <a:blip r:embed="rId18"/>
+                    <a:blip r:embed="rId21"/>
                     <a:stretch>
                       <a:fillRect/>
                     </a:stretch>
@@ -1556,21 +1625,21 @@
     </w:p>
     <w:p>
       <w:pPr>
-        <w:pStyle w:val="ListParagraph"/>
+        <w:pStyle w:val="af0"/>
         <w:numPr>
           <w:ilvl w:val="0"/>
           <w:numId w:val="1"/>
         </w:numPr>
-        <w:ind w:hanging="360" w:start="360"/>
-        <w:rPr>
-          <w:rFonts w:ascii="Times New Roman" w:hAnsi="Times New Roman" w:cs="Times New Roman"/>
-          <w:sz w:val="28"/>
-          <w:szCs w:val="28"/>
-        </w:rPr>
-      </w:pPr>
-      <w:r>
-        <w:rPr>
-          <w:rFonts w:cs="Times New Roman" w:ascii="Times New Roman" w:hAnsi="Times New Roman"/>
+        <w:ind w:left="360"/>
+        <w:rPr>
+          <w:rFonts w:ascii="Times New Roman" w:hAnsi="Times New Roman" w:cs="Times New Roman"/>
+          <w:sz w:val="28"/>
+          <w:szCs w:val="28"/>
+        </w:rPr>
+      </w:pPr>
+      <w:r>
+        <w:rPr>
+          <w:rFonts w:ascii="Times New Roman" w:hAnsi="Times New Roman" w:cs="Times New Roman"/>
           <w:sz w:val="28"/>
           <w:szCs w:val="28"/>
         </w:rPr>
@@ -1578,7 +1647,7 @@
       </w:r>
       <w:r>
         <w:rPr>
-          <w:rFonts w:cs="Times New Roman" w:ascii="Times New Roman" w:hAnsi="Times New Roman"/>
+          <w:rFonts w:ascii="Times New Roman" w:hAnsi="Times New Roman" w:cs="Times New Roman"/>
           <w:sz w:val="28"/>
           <w:szCs w:val="28"/>
           <w:lang w:val="en-US"/>
@@ -1587,39 +1656,69 @@
       </w:r>
       <w:r>
         <w:rPr>
-          <w:rFonts w:cs="Times New Roman" w:ascii="Times New Roman" w:hAnsi="Times New Roman"/>
-          <w:sz w:val="28"/>
-          <w:szCs w:val="28"/>
-        </w:rPr>
-        <w:t xml:space="preserve"> в  </w:t>
-      </w:r>
-      <w:r>
-        <w:rPr>
-          <w:rFonts w:cs="Times New Roman" w:ascii="Times New Roman" w:hAnsi="Times New Roman"/>
+          <w:rFonts w:ascii="Times New Roman" w:hAnsi="Times New Roman" w:cs="Times New Roman"/>
+          <w:sz w:val="28"/>
+          <w:szCs w:val="28"/>
+        </w:rPr>
+        <w:t xml:space="preserve"> </w:t>
+      </w:r>
+      <w:proofErr w:type="gramStart"/>
+      <w:r>
+        <w:rPr>
+          <w:rFonts w:ascii="Times New Roman" w:hAnsi="Times New Roman" w:cs="Times New Roman"/>
+          <w:sz w:val="28"/>
+          <w:szCs w:val="28"/>
+        </w:rPr>
+        <w:t xml:space="preserve">в  </w:t>
+      </w:r>
+      <w:proofErr w:type="spellStart"/>
+      <w:r>
+        <w:rPr>
+          <w:rFonts w:ascii="Times New Roman" w:hAnsi="Times New Roman" w:cs="Times New Roman"/>
           <w:sz w:val="28"/>
           <w:szCs w:val="28"/>
           <w:lang w:val="en-US"/>
         </w:rPr>
         <w:t>DBeaver</w:t>
       </w:r>
-      <w:r>
-        <w:rPr>
-          <w:rFonts w:cs="Times New Roman" w:ascii="Times New Roman" w:hAnsi="Times New Roman"/>
-          <w:sz w:val="28"/>
-          <w:szCs w:val="28"/>
-        </w:rPr>
-        <w:t>. Введите корректные данные – адрес сервера,база данных, пользователь и пароль. Проверьте подключение, нажав на кнопку Тест соединения</w:t>
-      </w:r>
-    </w:p>
-    <w:p>
-      <w:pPr>
-        <w:pStyle w:val="Normal"/>
-        <w:rPr/>
-      </w:pPr>
-      <w:r>
-        <w:rPr/>
+      <w:proofErr w:type="spellEnd"/>
+      <w:proofErr w:type="gramEnd"/>
+      <w:r>
+        <w:rPr>
+          <w:rFonts w:ascii="Times New Roman" w:hAnsi="Times New Roman" w:cs="Times New Roman"/>
+          <w:sz w:val="28"/>
+          <w:szCs w:val="28"/>
+        </w:rPr>
+        <w:t xml:space="preserve">. Введите корректные данные – адрес </w:t>
+      </w:r>
+      <w:proofErr w:type="spellStart"/>
+      <w:proofErr w:type="gramStart"/>
+      <w:r>
+        <w:rPr>
+          <w:rFonts w:ascii="Times New Roman" w:hAnsi="Times New Roman" w:cs="Times New Roman"/>
+          <w:sz w:val="28"/>
+          <w:szCs w:val="28"/>
+        </w:rPr>
+        <w:t>сервера,база</w:t>
+      </w:r>
+      <w:proofErr w:type="spellEnd"/>
+      <w:proofErr w:type="gramEnd"/>
+      <w:r>
+        <w:rPr>
+          <w:rFonts w:ascii="Times New Roman" w:hAnsi="Times New Roman" w:cs="Times New Roman"/>
+          <w:sz w:val="28"/>
+          <w:szCs w:val="28"/>
+        </w:rPr>
+        <w:t xml:space="preserve"> данных, пользователь и пароль. Проверьте подключение, нажав на кнопку Тест соединения</w:t>
+      </w:r>
+    </w:p>
+    <w:p>
+      <w:r>
+        <w:rPr>
+          <w:noProof/>
+        </w:rPr>
         <w:drawing>
-          <wp:inline distT="0" distB="0" distL="0" distR="0">
+          <wp:inline distT="0" distB="0" distL="0" distR="0" wp14:anchorId="03522C1F" wp14:editId="027340E3">
             <wp:extent cx="3648710" cy="2860040"/>
             <wp:effectExtent l="0" t="0" r="0" b="0"/>
             <wp:docPr id="18" name="Рисунок 13"/>
@@ -1636,7 +1735,7 @@
                     </pic:cNvPicPr>
                   </pic:nvPicPr>
                   <pic:blipFill>
-                    <a:blip r:embed="rId19"/>
+                    <a:blip r:embed="rId22"/>
                     <a:stretch>
                       <a:fillRect/>
                     </a:stretch>
@@ -1660,16 +1759,15 @@
     </w:p>
     <w:p>
       <w:pPr>
-        <w:pStyle w:val="Normal"/>
-        <w:rPr>
-          <w:rFonts w:ascii="Times New Roman" w:hAnsi="Times New Roman" w:cs="Times New Roman"/>
-          <w:sz w:val="28"/>
-          <w:szCs w:val="28"/>
-        </w:rPr>
-      </w:pPr>
-      <w:r>
-        <w:rPr>
-          <w:rFonts w:cs="Times New Roman" w:ascii="Times New Roman" w:hAnsi="Times New Roman"/>
+        <w:rPr>
+          <w:rFonts w:ascii="Times New Roman" w:hAnsi="Times New Roman" w:cs="Times New Roman"/>
+          <w:sz w:val="28"/>
+          <w:szCs w:val="28"/>
+        </w:rPr>
+      </w:pPr>
+      <w:r>
+        <w:rPr>
+          <w:rFonts w:ascii="Times New Roman" w:hAnsi="Times New Roman" w:cs="Times New Roman"/>
           <w:sz w:val="28"/>
           <w:szCs w:val="28"/>
         </w:rPr>
@@ -1678,15 +1776,16 @@
     </w:p>
     <w:p>
       <w:pPr>
-        <w:pStyle w:val="Normal"/>
-        <w:rPr>
-          <w:rFonts w:ascii="Times New Roman" w:hAnsi="Times New Roman" w:cs="Times New Roman"/>
-        </w:rPr>
-      </w:pPr>
-      <w:r>
-        <w:rPr/>
+        <w:rPr>
+          <w:rFonts w:ascii="Times New Roman" w:hAnsi="Times New Roman" w:cs="Times New Roman"/>
+        </w:rPr>
+      </w:pPr>
+      <w:r>
+        <w:rPr>
+          <w:noProof/>
+        </w:rPr>
         <w:drawing>
-          <wp:inline distT="0" distB="0" distL="0" distR="0">
+          <wp:inline distT="0" distB="0" distL="0" distR="0" wp14:anchorId="1A8CEA9C" wp14:editId="2B11183E">
             <wp:extent cx="2990850" cy="2246630"/>
             <wp:effectExtent l="0" t="0" r="0" b="0"/>
             <wp:docPr id="19" name="Рисунок 14"/>
@@ -1703,7 +1802,7 @@
                     </pic:cNvPicPr>
                   </pic:nvPicPr>
                   <pic:blipFill>
-                    <a:blip r:embed="rId20"/>
+                    <a:blip r:embed="rId23"/>
                     <a:stretch>
                       <a:fillRect/>
                     </a:stretch>
@@ -1727,53 +1826,56 @@
     </w:p>
     <w:p>
       <w:pPr>
-        <w:pStyle w:val="ListParagraph"/>
+        <w:pStyle w:val="af0"/>
         <w:numPr>
           <w:ilvl w:val="0"/>
           <w:numId w:val="1"/>
         </w:numPr>
-        <w:ind w:hanging="360" w:start="360"/>
-        <w:rPr>
-          <w:rFonts w:ascii="Times New Roman" w:hAnsi="Times New Roman" w:cs="Times New Roman"/>
-          <w:sz w:val="28"/>
-          <w:szCs w:val="28"/>
-        </w:rPr>
-      </w:pPr>
-      <w:r>
-        <w:rPr>
-          <w:rFonts w:cs="Times New Roman" w:ascii="Times New Roman" w:hAnsi="Times New Roman"/>
-          <w:sz w:val="28"/>
-          <w:szCs w:val="28"/>
-        </w:rPr>
-      </w:r>
-    </w:p>
-    <w:p>
-      <w:pPr>
-        <w:pStyle w:val="ListParagraph"/>
+        <w:ind w:left="360"/>
+        <w:rPr>
+          <w:rFonts w:ascii="Times New Roman" w:hAnsi="Times New Roman" w:cs="Times New Roman"/>
+          <w:sz w:val="28"/>
+          <w:szCs w:val="28"/>
+        </w:rPr>
+      </w:pPr>
+    </w:p>
+    <w:p>
+      <w:pPr>
+        <w:pStyle w:val="af0"/>
         <w:numPr>
           <w:ilvl w:val="0"/>
           <w:numId w:val="1"/>
         </w:numPr>
-        <w:ind w:hanging="360" w:start="360"/>
-        <w:rPr>
-          <w:rFonts w:ascii="Times New Roman" w:hAnsi="Times New Roman" w:cs="Times New Roman"/>
-          <w:sz w:val="28"/>
-          <w:szCs w:val="28"/>
-        </w:rPr>
-      </w:pPr>
-      <w:r>
-        <w:rPr>
-          <w:rFonts w:cs="Times New Roman" w:ascii="Times New Roman" w:hAnsi="Times New Roman"/>
-          <w:sz w:val="28"/>
-          <w:szCs w:val="28"/>
-        </w:rPr>
+        <w:ind w:left="360"/>
+        <w:rPr>
+          <w:rFonts w:ascii="Times New Roman" w:hAnsi="Times New Roman" w:cs="Times New Roman"/>
+          <w:sz w:val="28"/>
+          <w:szCs w:val="28"/>
+        </w:rPr>
+      </w:pPr>
+      <w:r>
+        <w:rPr>
+          <w:rFonts w:ascii="Times New Roman" w:hAnsi="Times New Roman" w:cs="Times New Roman"/>
+          <w:sz w:val="28"/>
+          <w:szCs w:val="28"/>
+        </w:rPr>
+        <w:lastRenderedPageBreak/>
         <w:t>Проверьте, что появилась БД со всеми таблицами, находящимися на хостинге.</w:t>
+      </w:r>
+      <w:r>
+        <w:rPr>
+          <w:rFonts w:ascii="Times New Roman" w:hAnsi="Times New Roman" w:cs="Times New Roman"/>
+          <w:sz w:val="28"/>
+          <w:szCs w:val="28"/>
+        </w:rPr>
         <w:br/>
       </w:r>
       <w:r>
-        <w:rPr/>
+        <w:rPr>
+          <w:noProof/>
+        </w:rPr>
         <w:drawing>
-          <wp:inline distT="0" distB="0" distL="0" distR="0">
+          <wp:inline distT="0" distB="0" distL="0" distR="0" wp14:anchorId="49DBCFDE" wp14:editId="10C25B02">
             <wp:extent cx="5080635" cy="4490085"/>
             <wp:effectExtent l="0" t="0" r="0" b="0"/>
             <wp:docPr id="20" name="Рисунок 15"/>
@@ -1790,7 +1892,7 @@
                     </pic:cNvPicPr>
                   </pic:nvPicPr>
                   <pic:blipFill>
-                    <a:blip r:embed="rId21"/>
+                    <a:blip r:embed="rId24"/>
                     <a:stretch>
                       <a:fillRect/>
                     </a:stretch>
@@ -1814,44 +1916,62 @@
     </w:p>
     <w:p>
       <w:pPr>
-        <w:pStyle w:val="ListParagraph"/>
+        <w:pStyle w:val="af0"/>
         <w:numPr>
           <w:ilvl w:val="0"/>
           <w:numId w:val="1"/>
         </w:numPr>
-        <w:ind w:hanging="360" w:start="360"/>
-        <w:rPr>
-          <w:rFonts w:ascii="Times New Roman" w:hAnsi="Times New Roman" w:cs="Times New Roman"/>
-          <w:sz w:val="28"/>
-          <w:szCs w:val="28"/>
-        </w:rPr>
-      </w:pPr>
-      <w:r>
-        <w:rPr>
-          <w:rFonts w:cs="Times New Roman" w:ascii="Times New Roman" w:hAnsi="Times New Roman"/>
-          <w:sz w:val="28"/>
-          <w:szCs w:val="28"/>
-        </w:rPr>
-        <w:t>Выполните через DBeaver операции добавления, изменения и удаления в БД. Проверьте внесенные изменения в БД через админ-панель на хостинге.</w:t>
-      </w:r>
-    </w:p>
-    <w:p>
-      <w:pPr>
-        <w:pStyle w:val="ListParagraph"/>
+        <w:ind w:left="360"/>
+        <w:rPr>
+          <w:rFonts w:ascii="Times New Roman" w:hAnsi="Times New Roman" w:cs="Times New Roman"/>
+          <w:sz w:val="28"/>
+          <w:szCs w:val="28"/>
+        </w:rPr>
+      </w:pPr>
+      <w:r>
+        <w:rPr>
+          <w:rFonts w:ascii="Times New Roman" w:hAnsi="Times New Roman" w:cs="Times New Roman"/>
+          <w:sz w:val="28"/>
+          <w:szCs w:val="28"/>
+        </w:rPr>
+        <w:t xml:space="preserve">Выполните через </w:t>
+      </w:r>
+      <w:proofErr w:type="spellStart"/>
+      <w:r>
+        <w:rPr>
+          <w:rFonts w:ascii="Times New Roman" w:hAnsi="Times New Roman" w:cs="Times New Roman"/>
+          <w:sz w:val="28"/>
+          <w:szCs w:val="28"/>
+        </w:rPr>
+        <w:t>DBeaver</w:t>
+      </w:r>
+      <w:proofErr w:type="spellEnd"/>
+      <w:r>
+        <w:rPr>
+          <w:rFonts w:ascii="Times New Roman" w:hAnsi="Times New Roman" w:cs="Times New Roman"/>
+          <w:sz w:val="28"/>
+          <w:szCs w:val="28"/>
+        </w:rPr>
+        <w:t xml:space="preserve"> операции добавления, изменения и удаления в БД. Проверьте внесенные изменения в БД через админ-панель на хостинге.</w:t>
+      </w:r>
+    </w:p>
+    <w:p>
+      <w:pPr>
+        <w:pStyle w:val="af0"/>
         <w:numPr>
           <w:ilvl w:val="0"/>
           <w:numId w:val="1"/>
         </w:numPr>
-        <w:ind w:hanging="360" w:start="360"/>
-        <w:rPr>
-          <w:rFonts w:ascii="Times New Roman" w:hAnsi="Times New Roman" w:cs="Times New Roman"/>
-          <w:sz w:val="28"/>
-          <w:szCs w:val="28"/>
-        </w:rPr>
-      </w:pPr>
-      <w:r>
-        <w:rPr>
-          <w:rFonts w:cs="Times New Roman" w:ascii="Times New Roman" w:hAnsi="Times New Roman"/>
+        <w:ind w:left="360"/>
+        <w:rPr>
+          <w:rFonts w:ascii="Times New Roman" w:hAnsi="Times New Roman" w:cs="Times New Roman"/>
+          <w:sz w:val="28"/>
+          <w:szCs w:val="28"/>
+        </w:rPr>
+      </w:pPr>
+      <w:r>
+        <w:rPr>
+          <w:rFonts w:ascii="Times New Roman" w:hAnsi="Times New Roman" w:cs="Times New Roman"/>
           <w:sz w:val="28"/>
           <w:szCs w:val="28"/>
         </w:rPr>
@@ -1860,21 +1980,21 @@
     </w:p>
     <w:p>
       <w:pPr>
-        <w:pStyle w:val="ListParagraph"/>
+        <w:pStyle w:val="af0"/>
         <w:numPr>
           <w:ilvl w:val="0"/>
           <w:numId w:val="1"/>
         </w:numPr>
-        <w:ind w:hanging="360" w:start="360"/>
-        <w:rPr>
-          <w:rFonts w:ascii="Times New Roman" w:hAnsi="Times New Roman" w:cs="Times New Roman"/>
-          <w:sz w:val="28"/>
-          <w:szCs w:val="28"/>
-        </w:rPr>
-      </w:pPr>
-      <w:r>
-        <w:rPr>
-          <w:rFonts w:cs="Times New Roman" w:ascii="Times New Roman" w:hAnsi="Times New Roman"/>
+        <w:ind w:left="360"/>
+        <w:rPr>
+          <w:rFonts w:ascii="Times New Roman" w:hAnsi="Times New Roman" w:cs="Times New Roman"/>
+          <w:sz w:val="28"/>
+          <w:szCs w:val="28"/>
+        </w:rPr>
+      </w:pPr>
+      <w:r>
+        <w:rPr>
+          <w:rFonts w:ascii="Times New Roman" w:hAnsi="Times New Roman" w:cs="Times New Roman"/>
           <w:sz w:val="28"/>
           <w:szCs w:val="28"/>
         </w:rPr>
@@ -1883,21 +2003,21 @@
     </w:p>
     <w:p>
       <w:pPr>
-        <w:pStyle w:val="ListParagraph"/>
+        <w:pStyle w:val="af0"/>
         <w:numPr>
           <w:ilvl w:val="0"/>
           <w:numId w:val="1"/>
         </w:numPr>
-        <w:ind w:hanging="360" w:start="360"/>
-        <w:rPr>
-          <w:rFonts w:ascii="Times New Roman" w:hAnsi="Times New Roman" w:cs="Times New Roman"/>
-          <w:sz w:val="28"/>
-          <w:szCs w:val="28"/>
-        </w:rPr>
-      </w:pPr>
-      <w:r>
-        <w:rPr>
-          <w:rFonts w:cs="Times New Roman" w:ascii="Times New Roman" w:hAnsi="Times New Roman"/>
+        <w:ind w:left="360"/>
+        <w:rPr>
+          <w:rFonts w:ascii="Times New Roman" w:hAnsi="Times New Roman" w:cs="Times New Roman"/>
+          <w:sz w:val="28"/>
+          <w:szCs w:val="28"/>
+        </w:rPr>
+      </w:pPr>
+      <w:r>
+        <w:rPr>
+          <w:rFonts w:ascii="Times New Roman" w:hAnsi="Times New Roman" w:cs="Times New Roman"/>
           <w:sz w:val="28"/>
           <w:szCs w:val="28"/>
         </w:rPr>
@@ -1906,22 +2026,20 @@
     </w:p>
     <w:p>
       <w:pPr>
-        <w:pStyle w:val="ListParagraph"/>
+        <w:pStyle w:val="af0"/>
         <w:numPr>
           <w:ilvl w:val="0"/>
           <w:numId w:val="1"/>
         </w:numPr>
-        <w:spacing w:before="0" w:after="160"/>
-        <w:contextualSpacing/>
-        <w:rPr>
-          <w:rFonts w:ascii="Times New Roman" w:hAnsi="Times New Roman" w:cs="Times New Roman"/>
-          <w:sz w:val="28"/>
-          <w:szCs w:val="28"/>
-        </w:rPr>
-      </w:pPr>
-      <w:r>
-        <w:rPr>
-          <w:rFonts w:cs="Times New Roman" w:ascii="Times New Roman" w:hAnsi="Times New Roman"/>
+        <w:rPr>
+          <w:rFonts w:ascii="Times New Roman" w:hAnsi="Times New Roman" w:cs="Times New Roman"/>
+          <w:sz w:val="28"/>
+          <w:szCs w:val="28"/>
+        </w:rPr>
+      </w:pPr>
+      <w:r>
+        <w:rPr>
+          <w:rFonts w:ascii="Times New Roman" w:hAnsi="Times New Roman" w:cs="Times New Roman"/>
           <w:sz w:val="28"/>
           <w:szCs w:val="28"/>
           <w:highlight w:val="yellow"/>
@@ -1929,156 +2047,150 @@
         <w:t>Дополнительное задание.</w:t>
       </w:r>
       <w:r>
-        <w:rPr/>
         <w:t xml:space="preserve">                                                  </w:t>
       </w:r>
     </w:p>
     <w:sectPr>
-      <w:type w:val="nextPage"/>
       <w:pgSz w:w="11906" w:h="16838"/>
-      <w:pgMar w:left="993" w:right="850" w:gutter="0" w:header="0" w:top="568" w:footer="0" w:bottom="1134"/>
-      <w:pgNumType w:fmt="decimal"/>
-      <w:formProt w:val="false"/>
-      <w:textDirection w:val="lrTb"/>
-      <w:docGrid w:type="default" w:linePitch="360" w:charSpace="0"/>
+      <w:pgMar w:top="568" w:right="850" w:bottom="1134" w:left="993" w:header="0" w:footer="0" w:gutter="0"/>
+      <w:cols w:space="720"/>
+      <w:formProt w:val="0"/>
+      <w:docGrid w:linePitch="360"/>
     </w:sectPr>
   </w:body>
 </w:document>
 </file>
 
 <file path=word/numbering.xml><?xml version="1.0" encoding="utf-8"?>
-<w:numbering xmlns:w="http://schemas.openxmlformats.org/wordprocessingml/2006/main" xmlns:o="urn:schemas-microsoft-com:office:office" xmlns:r="http://schemas.openxmlformats.org/officeDocument/2006/relationships" xmlns:v="urn:schemas-microsoft-com:vml" xmlns:mc="http://schemas.openxmlformats.org/markup-compatibility/2006" xmlns:w14="http://schemas.microsoft.com/office/word/2010/wordml" mc:Ignorable="w14">
-  <w:abstractNum w:abstractNumId="1">
+<w:numbering xmlns:wpc="http://schemas.microsoft.com/office/word/2010/wordprocessingCanvas" xmlns:cx="http://schemas.microsoft.com/office/drawing/2014/chartex" xmlns:cx1="http://schemas.microsoft.com/office/drawing/2015/9/8/chartex" xmlns:cx2="http://schemas.microsoft.com/office/drawing/2015/10/21/chartex" xmlns:cx3="http://schemas.microsoft.com/office/drawing/2016/5/9/chartex" xmlns:cx4="http://schemas.microsoft.com/office/drawing/2016/5/10/chartex" xmlns:cx5="http://schemas.microsoft.com/office/drawing/2016/5/11/chartex" xmlns:cx6="http://schemas.microsoft.com/office/drawing/2016/5/12/chartex" xmlns:cx7="http://schemas.microsoft.com/office/drawing/2016/5/13/chartex" xmlns:cx8="http://schemas.microsoft.com/office/drawing/2016/5/14/chartex" xmlns:mc="http://schemas.openxmlformats.org/markup-compatibility/2006" xmlns:aink="http://schemas.microsoft.com/office/drawing/2016/ink" xmlns:am3d="http://schemas.microsoft.com/office/drawing/2017/model3d" xmlns:o="urn:schemas-microsoft-com:office:office" xmlns:oel="http://schemas.microsoft.com/office/2019/extlst" xmlns:r="http://schemas.openxmlformats.org/officeDocument/2006/relationships" xmlns:m="http://schemas.openxmlformats.org/officeDocument/2006/math" xmlns:v="urn:schemas-microsoft-com:vml" xmlns:wp14="http://schemas.microsoft.com/office/word/2010/wordprocessingDrawing" xmlns:wp="http://schemas.openxmlformats.org/drawingml/2006/wordprocessingDrawing" xmlns:w10="urn:schemas-microsoft-com:office:word" xmlns:w="http://schemas.openxmlformats.org/wordprocessingml/2006/main" xmlns:w14="http://schemas.microsoft.com/office/word/2010/wordml" xmlns:w15="http://schemas.microsoft.com/office/word/2012/wordml" xmlns:w16cex="http://schemas.microsoft.com/office/word/2018/wordml/cex" xmlns:w16cid="http://schemas.microsoft.com/office/word/2016/wordml/cid" xmlns:w16="http://schemas.microsoft.com/office/word/2018/wordml" xmlns:w16du="http://schemas.microsoft.com/office/word/2023/wordml/word16du" xmlns:w16sdtdh="http://schemas.microsoft.com/office/word/2020/wordml/sdtdatahash" xmlns:w16sdtfl="http://schemas.microsoft.com/office/word/2024/wordml/sdtformatlock" xmlns:w16se="http://schemas.microsoft.com/office/word/2015/wordml/symex" xmlns:wpg="http://schemas.microsoft.com/office/word/2010/wordprocessingGroup" xmlns:wpi="http://schemas.microsoft.com/office/word/2010/wordprocessingInk" xmlns:wne="http://schemas.microsoft.com/office/word/2006/wordml" xmlns:wps="http://schemas.microsoft.com/office/word/2010/wordprocessingShape" mc:Ignorable="w14 w15 w16se w16cid w16 w16cex w16sdtdh w16sdtfl w16du wp14">
+  <w:abstractNum w:abstractNumId="0" w15:restartNumberingAfterBreak="0">
+    <w:nsid w:val="009C0A30"/>
+    <w:multiLevelType w:val="multilevel"/>
+    <w:tmpl w:val="2B1C5392"/>
     <w:lvl w:ilvl="0">
       <w:start w:val="1"/>
       <w:numFmt w:val="decimal"/>
       <w:lvlText w:val="%1."/>
-      <w:lvlJc w:val="start"/>
+      <w:lvlJc w:val="left"/>
       <w:pPr>
         <w:tabs>
           <w:tab w:val="num" w:pos="0"/>
         </w:tabs>
-        <w:ind w:start="502" w:hanging="360"/>
-      </w:pPr>
-      <w:rPr/>
+        <w:ind w:left="502" w:hanging="360"/>
+      </w:pPr>
     </w:lvl>
     <w:lvl w:ilvl="1">
       <w:start w:val="1"/>
       <w:numFmt w:val="lowerLetter"/>
       <w:lvlText w:val="%2."/>
-      <w:lvlJc w:val="start"/>
+      <w:lvlJc w:val="left"/>
       <w:pPr>
         <w:tabs>
           <w:tab w:val="num" w:pos="0"/>
         </w:tabs>
-        <w:ind w:start="1440" w:hanging="360"/>
-      </w:pPr>
-      <w:rPr/>
+        <w:ind w:left="1440" w:hanging="360"/>
+      </w:pPr>
     </w:lvl>
     <w:lvl w:ilvl="2">
       <w:start w:val="1"/>
       <w:numFmt w:val="lowerRoman"/>
       <w:lvlText w:val="%3."/>
-      <w:lvlJc w:val="end"/>
+      <w:lvlJc w:val="right"/>
       <w:pPr>
         <w:tabs>
           <w:tab w:val="num" w:pos="0"/>
         </w:tabs>
-        <w:ind w:start="2160" w:hanging="180"/>
-      </w:pPr>
-      <w:rPr/>
+        <w:ind w:left="2160" w:hanging="180"/>
+      </w:pPr>
     </w:lvl>
     <w:lvl w:ilvl="3">
       <w:start w:val="1"/>
       <w:numFmt w:val="decimal"/>
       <w:lvlText w:val="%4."/>
-      <w:lvlJc w:val="start"/>
+      <w:lvlJc w:val="left"/>
       <w:pPr>
         <w:tabs>
           <w:tab w:val="num" w:pos="0"/>
         </w:tabs>
-        <w:ind w:start="2880" w:hanging="360"/>
-      </w:pPr>
-      <w:rPr/>
+        <w:ind w:left="2880" w:hanging="360"/>
+      </w:pPr>
     </w:lvl>
     <w:lvl w:ilvl="4">
       <w:start w:val="1"/>
       <w:numFmt w:val="lowerLetter"/>
       <w:lvlText w:val="%5."/>
-      <w:lvlJc w:val="start"/>
+      <w:lvlJc w:val="left"/>
       <w:pPr>
         <w:tabs>
           <w:tab w:val="num" w:pos="0"/>
         </w:tabs>
-        <w:ind w:start="3600" w:hanging="360"/>
-      </w:pPr>
-      <w:rPr/>
+        <w:ind w:left="3600" w:hanging="360"/>
+      </w:pPr>
     </w:lvl>
     <w:lvl w:ilvl="5">
       <w:start w:val="1"/>
       <w:numFmt w:val="lowerRoman"/>
       <w:lvlText w:val="%6."/>
-      <w:lvlJc w:val="end"/>
+      <w:lvlJc w:val="right"/>
       <w:pPr>
         <w:tabs>
           <w:tab w:val="num" w:pos="0"/>
         </w:tabs>
-        <w:ind w:start="4320" w:hanging="180"/>
-      </w:pPr>
-      <w:rPr/>
+        <w:ind w:left="4320" w:hanging="180"/>
+      </w:pPr>
     </w:lvl>
     <w:lvl w:ilvl="6">
       <w:start w:val="1"/>
       <w:numFmt w:val="decimal"/>
       <w:lvlText w:val="%7."/>
-      <w:lvlJc w:val="start"/>
+      <w:lvlJc w:val="left"/>
       <w:pPr>
         <w:tabs>
           <w:tab w:val="num" w:pos="0"/>
         </w:tabs>
-        <w:ind w:start="5040" w:hanging="360"/>
-      </w:pPr>
-      <w:rPr/>
+        <w:ind w:left="5040" w:hanging="360"/>
+      </w:pPr>
     </w:lvl>
     <w:lvl w:ilvl="7">
       <w:start w:val="1"/>
       <w:numFmt w:val="lowerLetter"/>
       <w:lvlText w:val="%8."/>
-      <w:lvlJc w:val="start"/>
+      <w:lvlJc w:val="left"/>
       <w:pPr>
         <w:tabs>
           <w:tab w:val="num" w:pos="0"/>
         </w:tabs>
-        <w:ind w:start="5760" w:hanging="360"/>
-      </w:pPr>
-      <w:rPr/>
+        <w:ind w:left="5760" w:hanging="360"/>
+      </w:pPr>
     </w:lvl>
     <w:lvl w:ilvl="8">
       <w:start w:val="1"/>
       <w:numFmt w:val="lowerRoman"/>
       <w:lvlText w:val="%9."/>
-      <w:lvlJc w:val="end"/>
+      <w:lvlJc w:val="right"/>
       <w:pPr>
         <w:tabs>
           <w:tab w:val="num" w:pos="0"/>
         </w:tabs>
-        <w:ind w:start="6480" w:hanging="180"/>
-      </w:pPr>
-      <w:rPr/>
+        <w:ind w:left="6480" w:hanging="180"/>
+      </w:pPr>
     </w:lvl>
   </w:abstractNum>
-  <w:abstractNum w:abstractNumId="2">
+  <w:abstractNum w:abstractNumId="1" w15:restartNumberingAfterBreak="0">
+    <w:nsid w:val="1AB13667"/>
+    <w:multiLevelType w:val="multilevel"/>
+    <w:tmpl w:val="95D0BDBA"/>
     <w:lvl w:ilvl="0">
       <w:start w:val="1"/>
       <w:numFmt w:val="none"/>
       <w:suff w:val="nothing"/>
       <w:lvlText w:val=""/>
-      <w:lvlJc w:val="start"/>
+      <w:lvlJc w:val="left"/>
       <w:pPr>
         <w:tabs>
           <w:tab w:val="num" w:pos="0"/>
         </w:tabs>
-        <w:ind w:start="0" w:hanging="0"/>
+        <w:ind w:left="0" w:firstLine="0"/>
       </w:pPr>
     </w:lvl>
     <w:lvl w:ilvl="1">
@@ -2086,12 +2198,12 @@
       <w:numFmt w:val="none"/>
       <w:suff w:val="nothing"/>
       <w:lvlText w:val=""/>
-      <w:lvlJc w:val="start"/>
+      <w:lvlJc w:val="left"/>
       <w:pPr>
         <w:tabs>
           <w:tab w:val="num" w:pos="0"/>
         </w:tabs>
-        <w:ind w:start="0" w:hanging="0"/>
+        <w:ind w:left="0" w:firstLine="0"/>
       </w:pPr>
     </w:lvl>
     <w:lvl w:ilvl="2">
@@ -2099,12 +2211,12 @@
       <w:numFmt w:val="none"/>
       <w:suff w:val="nothing"/>
       <w:lvlText w:val=""/>
-      <w:lvlJc w:val="start"/>
+      <w:lvlJc w:val="left"/>
       <w:pPr>
         <w:tabs>
           <w:tab w:val="num" w:pos="0"/>
         </w:tabs>
-        <w:ind w:start="0" w:hanging="0"/>
+        <w:ind w:left="0" w:firstLine="0"/>
       </w:pPr>
     </w:lvl>
     <w:lvl w:ilvl="3">
@@ -2112,12 +2224,12 @@
       <w:numFmt w:val="none"/>
       <w:suff w:val="nothing"/>
       <w:lvlText w:val=""/>
-      <w:lvlJc w:val="start"/>
+      <w:lvlJc w:val="left"/>
       <w:pPr>
         <w:tabs>
           <w:tab w:val="num" w:pos="0"/>
         </w:tabs>
-        <w:ind w:start="0" w:hanging="0"/>
+        <w:ind w:left="0" w:firstLine="0"/>
       </w:pPr>
     </w:lvl>
     <w:lvl w:ilvl="4">
@@ -2125,12 +2237,12 @@
       <w:numFmt w:val="none"/>
       <w:suff w:val="nothing"/>
       <w:lvlText w:val=""/>
-      <w:lvlJc w:val="start"/>
+      <w:lvlJc w:val="left"/>
       <w:pPr>
         <w:tabs>
           <w:tab w:val="num" w:pos="0"/>
         </w:tabs>
-        <w:ind w:start="0" w:hanging="0"/>
+        <w:ind w:left="0" w:firstLine="0"/>
       </w:pPr>
     </w:lvl>
     <w:lvl w:ilvl="5">
@@ -2138,12 +2250,12 @@
       <w:numFmt w:val="none"/>
       <w:suff w:val="nothing"/>
       <w:lvlText w:val=""/>
-      <w:lvlJc w:val="start"/>
+      <w:lvlJc w:val="left"/>
       <w:pPr>
         <w:tabs>
           <w:tab w:val="num" w:pos="0"/>
         </w:tabs>
-        <w:ind w:start="0" w:hanging="0"/>
+        <w:ind w:left="0" w:firstLine="0"/>
       </w:pPr>
     </w:lvl>
     <w:lvl w:ilvl="6">
@@ -2151,12 +2263,12 @@
       <w:numFmt w:val="none"/>
       <w:suff w:val="nothing"/>
       <w:lvlText w:val=""/>
-      <w:lvlJc w:val="start"/>
+      <w:lvlJc w:val="left"/>
       <w:pPr>
         <w:tabs>
           <w:tab w:val="num" w:pos="0"/>
         </w:tabs>
-        <w:ind w:start="0" w:hanging="0"/>
+        <w:ind w:left="0" w:firstLine="0"/>
       </w:pPr>
     </w:lvl>
     <w:lvl w:ilvl="7">
@@ -2164,12 +2276,12 @@
       <w:numFmt w:val="none"/>
       <w:suff w:val="nothing"/>
       <w:lvlText w:val=""/>
-      <w:lvlJc w:val="start"/>
+      <w:lvlJc w:val="left"/>
       <w:pPr>
         <w:tabs>
           <w:tab w:val="num" w:pos="0"/>
         </w:tabs>
-        <w:ind w:start="0" w:hanging="0"/>
+        <w:ind w:left="0" w:firstLine="0"/>
       </w:pPr>
     </w:lvl>
     <w:lvl w:ilvl="8">
@@ -2177,30 +2289,30 @@
       <w:numFmt w:val="none"/>
       <w:suff w:val="nothing"/>
       <w:lvlText w:val=""/>
-      <w:lvlJc w:val="start"/>
+      <w:lvlJc w:val="left"/>
       <w:pPr>
         <w:tabs>
           <w:tab w:val="num" w:pos="0"/>
         </w:tabs>
-        <w:ind w:start="0" w:hanging="0"/>
+        <w:ind w:left="0" w:firstLine="0"/>
       </w:pPr>
     </w:lvl>
   </w:abstractNum>
-  <w:num w:numId="1">
+  <w:num w:numId="1" w16cid:durableId="1813477567">
+    <w:abstractNumId w:val="0"/>
+  </w:num>
+  <w:num w:numId="2" w16cid:durableId="636691758">
     <w:abstractNumId w:val="1"/>
-  </w:num>
-  <w:num w:numId="2">
-    <w:abstractNumId w:val="2"/>
   </w:num>
 </w:numbering>
 </file>
 
 <file path=word/styles.xml><?xml version="1.0" encoding="utf-8"?>
-<w:styles xmlns:w="http://schemas.openxmlformats.org/wordprocessingml/2006/main" xmlns:w14="http://schemas.microsoft.com/office/word/2010/wordml" xmlns:mc="http://schemas.openxmlformats.org/markup-compatibility/2006" mc:Ignorable="w14">
+<w:styles xmlns:mc="http://schemas.openxmlformats.org/markup-compatibility/2006" xmlns:r="http://schemas.openxmlformats.org/officeDocument/2006/relationships" xmlns:w="http://schemas.openxmlformats.org/wordprocessingml/2006/main" xmlns:w14="http://schemas.microsoft.com/office/word/2010/wordml" xmlns:w15="http://schemas.microsoft.com/office/word/2012/wordml" xmlns:w16cex="http://schemas.microsoft.com/office/word/2018/wordml/cex" xmlns:w16cid="http://schemas.microsoft.com/office/word/2016/wordml/cid" xmlns:w16="http://schemas.microsoft.com/office/word/2018/wordml" xmlns:w16du="http://schemas.microsoft.com/office/word/2023/wordml/word16du" xmlns:w16sdtdh="http://schemas.microsoft.com/office/word/2020/wordml/sdtdatahash" xmlns:w16sdtfl="http://schemas.microsoft.com/office/word/2024/wordml/sdtformatlock" xmlns:w16se="http://schemas.microsoft.com/office/word/2015/wordml/symex" mc:Ignorable="w14 w15 w16se w16cid w16 w16cex w16sdtdh w16sdtfl w16du">
   <w:docDefaults>
     <w:rPrDefault>
       <w:rPr>
-        <w:rFonts w:ascii="Aptos" w:hAnsi="Aptos" w:eastAsia="Aptos" w:cs="" w:asciiTheme="minorHAnsi" w:cstheme="minorBidi" w:eastAsiaTheme="minorHAnsi" w:hAnsiTheme="minorHAnsi"/>
+        <w:rFonts w:asciiTheme="minorHAnsi" w:eastAsiaTheme="minorHAnsi" w:hAnsiTheme="minorHAnsi" w:cstheme="minorBidi"/>
         <w:kern w:val="2"/>
         <w:sz w:val="22"/>
         <w:szCs w:val="22"/>
@@ -2210,21 +2322,21 @@
     </w:rPrDefault>
     <w:pPrDefault>
       <w:pPr>
-        <w:suppressAutoHyphens w:val="true"/>
+        <w:suppressAutoHyphens/>
       </w:pPr>
     </w:pPrDefault>
   </w:docDefaults>
   <w:latentStyles w:defLockedState="0" w:defUIPriority="99" w:defSemiHidden="0" w:defUnhideWhenUsed="0" w:defQFormat="0" w:count="376">
     <w:lsdException w:name="Normal" w:uiPriority="0" w:qFormat="1"/>
     <w:lsdException w:name="heading 1" w:uiPriority="9" w:qFormat="1"/>
-    <w:lsdException w:name="heading 2" w:uiPriority="9" w:semiHidden="1" w:unhideWhenUsed="1" w:qFormat="1"/>
-    <w:lsdException w:name="heading 3" w:uiPriority="9" w:semiHidden="1" w:unhideWhenUsed="1" w:qFormat="1"/>
-    <w:lsdException w:name="heading 4" w:uiPriority="9" w:semiHidden="1" w:unhideWhenUsed="1" w:qFormat="1"/>
-    <w:lsdException w:name="heading 5" w:uiPriority="9" w:semiHidden="1" w:unhideWhenUsed="1" w:qFormat="1"/>
-    <w:lsdException w:name="heading 6" w:uiPriority="9" w:semiHidden="1" w:unhideWhenUsed="1" w:qFormat="1"/>
-    <w:lsdException w:name="heading 7" w:uiPriority="9" w:semiHidden="1" w:unhideWhenUsed="1" w:qFormat="1"/>
-    <w:lsdException w:name="heading 8" w:uiPriority="9" w:semiHidden="1" w:unhideWhenUsed="1" w:qFormat="1"/>
-    <w:lsdException w:name="heading 9" w:uiPriority="9" w:semiHidden="1" w:unhideWhenUsed="1" w:qFormat="1"/>
+    <w:lsdException w:name="heading 2" w:semiHidden="1" w:uiPriority="9" w:unhideWhenUsed="1" w:qFormat="1"/>
+    <w:lsdException w:name="heading 3" w:semiHidden="1" w:uiPriority="9" w:unhideWhenUsed="1" w:qFormat="1"/>
+    <w:lsdException w:name="heading 4" w:semiHidden="1" w:uiPriority="9" w:unhideWhenUsed="1" w:qFormat="1"/>
+    <w:lsdException w:name="heading 5" w:semiHidden="1" w:uiPriority="9" w:unhideWhenUsed="1" w:qFormat="1"/>
+    <w:lsdException w:name="heading 6" w:semiHidden="1" w:uiPriority="9" w:unhideWhenUsed="1" w:qFormat="1"/>
+    <w:lsdException w:name="heading 7" w:semiHidden="1" w:uiPriority="9" w:unhideWhenUsed="1" w:qFormat="1"/>
+    <w:lsdException w:name="heading 8" w:semiHidden="1" w:uiPriority="9" w:unhideWhenUsed="1" w:qFormat="1"/>
+    <w:lsdException w:name="heading 9" w:semiHidden="1" w:uiPriority="9" w:unhideWhenUsed="1" w:qFormat="1"/>
     <w:lsdException w:name="index 1" w:semiHidden="1" w:unhideWhenUsed="1"/>
     <w:lsdException w:name="index 2" w:semiHidden="1" w:unhideWhenUsed="1"/>
     <w:lsdException w:name="index 3" w:semiHidden="1" w:unhideWhenUsed="1"/>
@@ -2234,22 +2346,22 @@
     <w:lsdException w:name="index 7" w:semiHidden="1" w:unhideWhenUsed="1"/>
     <w:lsdException w:name="index 8" w:semiHidden="1" w:unhideWhenUsed="1"/>
     <w:lsdException w:name="index 9" w:semiHidden="1" w:unhideWhenUsed="1"/>
-    <w:lsdException w:name="toc 1" w:uiPriority="39" w:semiHidden="1" w:unhideWhenUsed="1"/>
-    <w:lsdException w:name="toc 2" w:uiPriority="39" w:semiHidden="1" w:unhideWhenUsed="1"/>
-    <w:lsdException w:name="toc 3" w:uiPriority="39" w:semiHidden="1" w:unhideWhenUsed="1"/>
-    <w:lsdException w:name="toc 4" w:uiPriority="39" w:semiHidden="1" w:unhideWhenUsed="1"/>
-    <w:lsdException w:name="toc 5" w:uiPriority="39" w:semiHidden="1" w:unhideWhenUsed="1"/>
-    <w:lsdException w:name="toc 6" w:uiPriority="39" w:semiHidden="1" w:unhideWhenUsed="1"/>
-    <w:lsdException w:name="toc 7" w:uiPriority="39" w:semiHidden="1" w:unhideWhenUsed="1"/>
-    <w:lsdException w:name="toc 8" w:uiPriority="39" w:semiHidden="1" w:unhideWhenUsed="1"/>
-    <w:lsdException w:name="toc 9" w:uiPriority="39" w:semiHidden="1" w:unhideWhenUsed="1"/>
+    <w:lsdException w:name="toc 1" w:semiHidden="1" w:uiPriority="39" w:unhideWhenUsed="1"/>
+    <w:lsdException w:name="toc 2" w:semiHidden="1" w:uiPriority="39" w:unhideWhenUsed="1"/>
+    <w:lsdException w:name="toc 3" w:semiHidden="1" w:uiPriority="39" w:unhideWhenUsed="1"/>
+    <w:lsdException w:name="toc 4" w:semiHidden="1" w:uiPriority="39" w:unhideWhenUsed="1"/>
+    <w:lsdException w:name="toc 5" w:semiHidden="1" w:uiPriority="39" w:unhideWhenUsed="1"/>
+    <w:lsdException w:name="toc 6" w:semiHidden="1" w:uiPriority="39" w:unhideWhenUsed="1"/>
+    <w:lsdException w:name="toc 7" w:semiHidden="1" w:uiPriority="39" w:unhideWhenUsed="1"/>
+    <w:lsdException w:name="toc 8" w:semiHidden="1" w:uiPriority="39" w:unhideWhenUsed="1"/>
+    <w:lsdException w:name="toc 9" w:semiHidden="1" w:uiPriority="39" w:unhideWhenUsed="1"/>
     <w:lsdException w:name="Normal Indent" w:semiHidden="1" w:unhideWhenUsed="1"/>
     <w:lsdException w:name="footnote text" w:semiHidden="1" w:unhideWhenUsed="1"/>
     <w:lsdException w:name="annotation text" w:semiHidden="1" w:unhideWhenUsed="1"/>
     <w:lsdException w:name="header" w:semiHidden="1" w:unhideWhenUsed="1"/>
     <w:lsdException w:name="footer" w:semiHidden="1" w:unhideWhenUsed="1"/>
     <w:lsdException w:name="index heading" w:semiHidden="1" w:unhideWhenUsed="1"/>
-    <w:lsdException w:name="caption" w:uiPriority="35" w:semiHidden="1" w:unhideWhenUsed="1" w:qFormat="1"/>
+    <w:lsdException w:name="caption" w:semiHidden="1" w:uiPriority="35" w:unhideWhenUsed="1" w:qFormat="1"/>
     <w:lsdException w:name="table of figures" w:semiHidden="1" w:unhideWhenUsed="1"/>
     <w:lsdException w:name="envelope address" w:semiHidden="1" w:unhideWhenUsed="1"/>
     <w:lsdException w:name="envelope return" w:semiHidden="1" w:unhideWhenUsed="1"/>
@@ -2280,7 +2392,7 @@
     <w:lsdException w:name="Title" w:uiPriority="10" w:qFormat="1"/>
     <w:lsdException w:name="Closing" w:semiHidden="1" w:unhideWhenUsed="1"/>
     <w:lsdException w:name="Signature" w:semiHidden="1" w:unhideWhenUsed="1"/>
-    <w:lsdException w:name="Default Paragraph Font" w:uiPriority="1" w:semiHidden="1" w:unhideWhenUsed="1"/>
+    <w:lsdException w:name="Default Paragraph Font" w:semiHidden="1" w:uiPriority="1" w:unhideWhenUsed="1"/>
     <w:lsdException w:name="Body Text" w:semiHidden="1" w:unhideWhenUsed="1"/>
     <w:lsdException w:name="Body Text Indent" w:semiHidden="1" w:unhideWhenUsed="1"/>
     <w:lsdException w:name="List Continue" w:semiHidden="1" w:unhideWhenUsed="1"/>
@@ -2480,8 +2592,8 @@
     <w:lsdException w:name="Subtle Reference" w:uiPriority="31" w:qFormat="1"/>
     <w:lsdException w:name="Intense Reference" w:uiPriority="32" w:qFormat="1"/>
     <w:lsdException w:name="Book Title" w:uiPriority="33" w:qFormat="1"/>
-    <w:lsdException w:name="Bibliography" w:uiPriority="37" w:semiHidden="1" w:unhideWhenUsed="1"/>
-    <w:lsdException w:name="TOC Heading" w:uiPriority="39" w:semiHidden="1" w:unhideWhenUsed="1" w:qFormat="1"/>
+    <w:lsdException w:name="Bibliography" w:semiHidden="1" w:uiPriority="37" w:unhideWhenUsed="1"/>
+    <w:lsdException w:name="TOC Heading" w:semiHidden="1" w:uiPriority="39" w:unhideWhenUsed="1" w:qFormat="1"/>
     <w:lsdException w:name="Plain Table 1" w:uiPriority="41"/>
     <w:lsdException w:name="Plain Table 2" w:uiPriority="42"/>
     <w:lsdException w:name="Plain Table 3" w:uiPriority="43"/>
@@ -2592,500 +2704,505 @@
     <w:lsdException w:name="Unresolved Mention" w:semiHidden="1" w:unhideWhenUsed="1"/>
     <w:lsdException w:name="Smart Link" w:semiHidden="1" w:unhideWhenUsed="1"/>
   </w:latentStyles>
-  <w:style w:type="paragraph" w:styleId="Normal" w:default="1">
+  <w:style w:type="paragraph" w:default="1" w:styleId="a">
     <w:name w:val="Normal"/>
     <w:qFormat/>
     <w:pPr>
-      <w:widowControl/>
-      <w:bidi w:val="0"/>
-      <w:spacing w:lineRule="auto" w:line="259" w:before="0" w:after="160"/>
-      <w:jc w:val="start"/>
+      <w:spacing w:after="160" w:line="259" w:lineRule="auto"/>
     </w:pPr>
-    <w:rPr>
-      <w:rFonts w:ascii="Aptos" w:hAnsi="Aptos" w:eastAsia="Aptos" w:cs="" w:asciiTheme="minorHAnsi" w:cstheme="minorBidi" w:eastAsiaTheme="minorHAnsi" w:hAnsiTheme="minorHAnsi"/>
-      <w:color w:val="auto"/>
-      <w:kern w:val="2"/>
-      <w:sz w:val="22"/>
-      <w:szCs w:val="22"/>
-      <w:lang w:val="ru-RU" w:eastAsia="en-US" w:bidi="ar-SA"/>
-      <w14:ligatures w14:val="standardContextual"/>
-    </w:rPr>
-  </w:style>
-  <w:style w:type="paragraph" w:styleId="Heading1">
+  </w:style>
+  <w:style w:type="paragraph" w:styleId="1">
     <w:name w:val="heading 1"/>
-    <w:basedOn w:val="Normal"/>
-    <w:next w:val="Normal"/>
-    <w:link w:val="1"/>
+    <w:basedOn w:val="a"/>
+    <w:next w:val="a"/>
+    <w:link w:val="10"/>
     <w:uiPriority w:val="9"/>
     <w:qFormat/>
-    <w:rsid w:val="00e731f3"/>
+    <w:rsid w:val="00E731F3"/>
     <w:pPr>
-      <w:keepNext w:val="true"/>
+      <w:keepNext/>
       <w:keepLines/>
       <w:spacing w:before="360" w:after="80"/>
       <w:outlineLvl w:val="0"/>
     </w:pPr>
     <w:rPr>
-      <w:rFonts w:ascii="Aptos Display" w:hAnsi="Aptos Display" w:eastAsia="" w:cs="" w:asciiTheme="majorHAnsi" w:cstheme="majorBidi" w:eastAsiaTheme="majorEastAsia" w:hAnsiTheme="majorHAnsi"/>
-      <w:color w:themeColor="accent1" w:themeShade="bf" w:val="0F4761"/>
+      <w:rFonts w:asciiTheme="majorHAnsi" w:eastAsiaTheme="majorEastAsia" w:hAnsiTheme="majorHAnsi" w:cstheme="majorBidi"/>
+      <w:color w:val="0F4761" w:themeColor="accent1" w:themeShade="BF"/>
       <w:sz w:val="40"/>
       <w:szCs w:val="40"/>
     </w:rPr>
   </w:style>
-  <w:style w:type="paragraph" w:styleId="Heading2">
+  <w:style w:type="paragraph" w:styleId="2">
     <w:name w:val="heading 2"/>
-    <w:basedOn w:val="Normal"/>
-    <w:next w:val="Normal"/>
-    <w:link w:val="2"/>
+    <w:basedOn w:val="a"/>
+    <w:next w:val="a"/>
+    <w:link w:val="20"/>
     <w:uiPriority w:val="9"/>
     <w:semiHidden/>
     <w:unhideWhenUsed/>
     <w:qFormat/>
-    <w:rsid w:val="00e731f3"/>
+    <w:rsid w:val="00E731F3"/>
     <w:pPr>
-      <w:keepNext w:val="true"/>
+      <w:keepNext/>
       <w:keepLines/>
       <w:spacing w:before="160" w:after="80"/>
       <w:outlineLvl w:val="1"/>
     </w:pPr>
     <w:rPr>
-      <w:rFonts w:ascii="Aptos Display" w:hAnsi="Aptos Display" w:eastAsia="" w:cs="" w:asciiTheme="majorHAnsi" w:cstheme="majorBidi" w:eastAsiaTheme="majorEastAsia" w:hAnsiTheme="majorHAnsi"/>
-      <w:color w:themeColor="accent1" w:themeShade="bf" w:val="0F4761"/>
+      <w:rFonts w:asciiTheme="majorHAnsi" w:eastAsiaTheme="majorEastAsia" w:hAnsiTheme="majorHAnsi" w:cstheme="majorBidi"/>
+      <w:color w:val="0F4761" w:themeColor="accent1" w:themeShade="BF"/>
       <w:sz w:val="32"/>
       <w:szCs w:val="32"/>
     </w:rPr>
   </w:style>
-  <w:style w:type="paragraph" w:styleId="Heading3">
+  <w:style w:type="paragraph" w:styleId="3">
     <w:name w:val="heading 3"/>
-    <w:basedOn w:val="Normal"/>
-    <w:next w:val="Normal"/>
-    <w:link w:val="3"/>
+    <w:basedOn w:val="a"/>
+    <w:next w:val="a"/>
+    <w:link w:val="30"/>
     <w:uiPriority w:val="9"/>
     <w:semiHidden/>
     <w:unhideWhenUsed/>
     <w:qFormat/>
-    <w:rsid w:val="00e731f3"/>
+    <w:rsid w:val="00E731F3"/>
     <w:pPr>
-      <w:keepNext w:val="true"/>
+      <w:keepNext/>
       <w:keepLines/>
       <w:spacing w:before="160" w:after="80"/>
       <w:outlineLvl w:val="2"/>
     </w:pPr>
     <w:rPr>
-      <w:rFonts w:eastAsia="" w:cs="" w:cstheme="majorBidi" w:eastAsiaTheme="majorEastAsia"/>
-      <w:color w:themeColor="accent1" w:themeShade="bf" w:val="0F4761"/>
+      <w:rFonts w:eastAsiaTheme="majorEastAsia" w:cstheme="majorBidi"/>
+      <w:color w:val="0F4761" w:themeColor="accent1" w:themeShade="BF"/>
       <w:sz w:val="28"/>
       <w:szCs w:val="28"/>
     </w:rPr>
   </w:style>
-  <w:style w:type="paragraph" w:styleId="Heading4">
+  <w:style w:type="paragraph" w:styleId="4">
     <w:name w:val="heading 4"/>
-    <w:basedOn w:val="Normal"/>
-    <w:next w:val="Normal"/>
-    <w:link w:val="4"/>
+    <w:basedOn w:val="a"/>
+    <w:next w:val="a"/>
+    <w:link w:val="40"/>
     <w:uiPriority w:val="9"/>
     <w:semiHidden/>
     <w:unhideWhenUsed/>
     <w:qFormat/>
-    <w:rsid w:val="00e731f3"/>
+    <w:rsid w:val="00E731F3"/>
     <w:pPr>
-      <w:keepNext w:val="true"/>
+      <w:keepNext/>
       <w:keepLines/>
       <w:spacing w:before="80" w:after="40"/>
       <w:outlineLvl w:val="3"/>
     </w:pPr>
     <w:rPr>
-      <w:rFonts w:eastAsia="" w:cs="" w:cstheme="majorBidi" w:eastAsiaTheme="majorEastAsia"/>
+      <w:rFonts w:eastAsiaTheme="majorEastAsia" w:cstheme="majorBidi"/>
       <w:i/>
       <w:iCs/>
-      <w:color w:themeColor="accent1" w:themeShade="bf" w:val="0F4761"/>
+      <w:color w:val="0F4761" w:themeColor="accent1" w:themeShade="BF"/>
     </w:rPr>
   </w:style>
-  <w:style w:type="paragraph" w:styleId="Heading5">
+  <w:style w:type="paragraph" w:styleId="5">
     <w:name w:val="heading 5"/>
-    <w:basedOn w:val="Normal"/>
-    <w:next w:val="Normal"/>
-    <w:link w:val="5"/>
+    <w:basedOn w:val="a"/>
+    <w:next w:val="a"/>
+    <w:link w:val="50"/>
     <w:uiPriority w:val="9"/>
     <w:semiHidden/>
     <w:unhideWhenUsed/>
     <w:qFormat/>
-    <w:rsid w:val="00e731f3"/>
+    <w:rsid w:val="00E731F3"/>
     <w:pPr>
-      <w:keepNext w:val="true"/>
+      <w:keepNext/>
       <w:keepLines/>
       <w:spacing w:before="80" w:after="40"/>
       <w:outlineLvl w:val="4"/>
     </w:pPr>
     <w:rPr>
-      <w:rFonts w:eastAsia="" w:cs="" w:cstheme="majorBidi" w:eastAsiaTheme="majorEastAsia"/>
-      <w:color w:themeColor="accent1" w:themeShade="bf" w:val="0F4761"/>
+      <w:rFonts w:eastAsiaTheme="majorEastAsia" w:cstheme="majorBidi"/>
+      <w:color w:val="0F4761" w:themeColor="accent1" w:themeShade="BF"/>
     </w:rPr>
   </w:style>
-  <w:style w:type="paragraph" w:styleId="Heading6">
+  <w:style w:type="paragraph" w:styleId="6">
     <w:name w:val="heading 6"/>
-    <w:basedOn w:val="Normal"/>
-    <w:next w:val="Normal"/>
-    <w:link w:val="6"/>
+    <w:basedOn w:val="a"/>
+    <w:next w:val="a"/>
+    <w:link w:val="60"/>
     <w:uiPriority w:val="9"/>
     <w:semiHidden/>
     <w:unhideWhenUsed/>
     <w:qFormat/>
-    <w:rsid w:val="00e731f3"/>
+    <w:rsid w:val="00E731F3"/>
     <w:pPr>
-      <w:keepNext w:val="true"/>
+      <w:keepNext/>
       <w:keepLines/>
       <w:spacing w:before="40" w:after="0"/>
       <w:outlineLvl w:val="5"/>
     </w:pPr>
     <w:rPr>
-      <w:rFonts w:eastAsia="" w:cs="" w:cstheme="majorBidi" w:eastAsiaTheme="majorEastAsia"/>
+      <w:rFonts w:eastAsiaTheme="majorEastAsia" w:cstheme="majorBidi"/>
       <w:i/>
       <w:iCs/>
-      <w:color w:themeColor="text1" w:themeTint="a6" w:val="595959"/>
+      <w:color w:val="595959" w:themeColor="text1" w:themeTint="A6"/>
     </w:rPr>
   </w:style>
-  <w:style w:type="paragraph" w:styleId="Heading7">
+  <w:style w:type="paragraph" w:styleId="7">
     <w:name w:val="heading 7"/>
-    <w:basedOn w:val="Normal"/>
-    <w:next w:val="Normal"/>
-    <w:link w:val="7"/>
+    <w:basedOn w:val="a"/>
+    <w:next w:val="a"/>
+    <w:link w:val="70"/>
     <w:uiPriority w:val="9"/>
     <w:semiHidden/>
     <w:unhideWhenUsed/>
     <w:qFormat/>
-    <w:rsid w:val="00e731f3"/>
+    <w:rsid w:val="00E731F3"/>
     <w:pPr>
-      <w:keepNext w:val="true"/>
+      <w:keepNext/>
       <w:keepLines/>
       <w:spacing w:before="40" w:after="0"/>
       <w:outlineLvl w:val="6"/>
     </w:pPr>
     <w:rPr>
-      <w:rFonts w:eastAsia="" w:cs="" w:cstheme="majorBidi" w:eastAsiaTheme="majorEastAsia"/>
-      <w:color w:themeColor="text1" w:themeTint="a6" w:val="595959"/>
+      <w:rFonts w:eastAsiaTheme="majorEastAsia" w:cstheme="majorBidi"/>
+      <w:color w:val="595959" w:themeColor="text1" w:themeTint="A6"/>
     </w:rPr>
   </w:style>
-  <w:style w:type="paragraph" w:styleId="Heading8">
+  <w:style w:type="paragraph" w:styleId="8">
     <w:name w:val="heading 8"/>
-    <w:basedOn w:val="Normal"/>
-    <w:next w:val="Normal"/>
-    <w:link w:val="8"/>
+    <w:basedOn w:val="a"/>
+    <w:next w:val="a"/>
+    <w:link w:val="80"/>
     <w:uiPriority w:val="9"/>
     <w:semiHidden/>
     <w:unhideWhenUsed/>
     <w:qFormat/>
-    <w:rsid w:val="00e731f3"/>
+    <w:rsid w:val="00E731F3"/>
     <w:pPr>
-      <w:keepNext w:val="true"/>
+      <w:keepNext/>
       <w:keepLines/>
-      <w:spacing w:before="0" w:after="0"/>
+      <w:spacing w:after="0"/>
       <w:outlineLvl w:val="7"/>
     </w:pPr>
     <w:rPr>
-      <w:rFonts w:eastAsia="" w:cs="" w:cstheme="majorBidi" w:eastAsiaTheme="majorEastAsia"/>
+      <w:rFonts w:eastAsiaTheme="majorEastAsia" w:cstheme="majorBidi"/>
       <w:i/>
       <w:iCs/>
-      <w:color w:themeColor="text1" w:themeTint="d8" w:val="272727"/>
+      <w:color w:val="272727" w:themeColor="text1" w:themeTint="D8"/>
     </w:rPr>
   </w:style>
-  <w:style w:type="paragraph" w:styleId="Heading9">
+  <w:style w:type="paragraph" w:styleId="9">
     <w:name w:val="heading 9"/>
-    <w:basedOn w:val="Normal"/>
-    <w:next w:val="Normal"/>
-    <w:link w:val="9"/>
+    <w:basedOn w:val="a"/>
+    <w:next w:val="a"/>
+    <w:link w:val="90"/>
     <w:uiPriority w:val="9"/>
     <w:semiHidden/>
     <w:unhideWhenUsed/>
     <w:qFormat/>
-    <w:rsid w:val="00e731f3"/>
+    <w:rsid w:val="00E731F3"/>
     <w:pPr>
-      <w:keepNext w:val="true"/>
+      <w:keepNext/>
       <w:keepLines/>
-      <w:spacing w:before="0" w:after="0"/>
+      <w:spacing w:after="0"/>
       <w:outlineLvl w:val="8"/>
     </w:pPr>
     <w:rPr>
-      <w:rFonts w:eastAsia="" w:cs="" w:cstheme="majorBidi" w:eastAsiaTheme="majorEastAsia"/>
-      <w:color w:themeColor="text1" w:themeTint="d8" w:val="272727"/>
+      <w:rFonts w:eastAsiaTheme="majorEastAsia" w:cstheme="majorBidi"/>
+      <w:color w:val="272727" w:themeColor="text1" w:themeTint="D8"/>
     </w:rPr>
   </w:style>
-  <w:style w:type="character" w:styleId="DefaultParagraphFont" w:default="1">
+  <w:style w:type="character" w:default="1" w:styleId="a0">
     <w:name w:val="Default Paragraph Font"/>
     <w:uiPriority w:val="1"/>
     <w:semiHidden/>
     <w:unhideWhenUsed/>
-    <w:qFormat/>
-    <w:rPr/>
-  </w:style>
-  <w:style w:type="character" w:styleId="1" w:customStyle="1">
+  </w:style>
+  <w:style w:type="table" w:default="1" w:styleId="a1">
+    <w:name w:val="Normal Table"/>
+    <w:uiPriority w:val="99"/>
+    <w:semiHidden/>
+    <w:unhideWhenUsed/>
+    <w:tblPr>
+      <w:tblInd w:w="0" w:type="dxa"/>
+      <w:tblCellMar>
+        <w:top w:w="0" w:type="dxa"/>
+        <w:left w:w="108" w:type="dxa"/>
+        <w:bottom w:w="0" w:type="dxa"/>
+        <w:right w:w="108" w:type="dxa"/>
+      </w:tblCellMar>
+    </w:tblPr>
+  </w:style>
+  <w:style w:type="numbering" w:default="1" w:styleId="a2">
+    <w:name w:val="No List"/>
+    <w:uiPriority w:val="99"/>
+    <w:semiHidden/>
+    <w:unhideWhenUsed/>
+  </w:style>
+  <w:style w:type="character" w:customStyle="1" w:styleId="10">
     <w:name w:val="Заголовок 1 Знак"/>
-    <w:basedOn w:val="DefaultParagraphFont"/>
-    <w:link w:val="Heading1"/>
+    <w:basedOn w:val="a0"/>
+    <w:link w:val="1"/>
     <w:uiPriority w:val="9"/>
     <w:qFormat/>
-    <w:rsid w:val="00e731f3"/>
+    <w:rsid w:val="00E731F3"/>
     <w:rPr>
-      <w:rFonts w:ascii="Aptos Display" w:hAnsi="Aptos Display" w:eastAsia="" w:cs="" w:asciiTheme="majorHAnsi" w:cstheme="majorBidi" w:eastAsiaTheme="majorEastAsia" w:hAnsiTheme="majorHAnsi"/>
-      <w:color w:themeColor="accent1" w:themeShade="bf" w:val="0F4761"/>
+      <w:rFonts w:asciiTheme="majorHAnsi" w:eastAsiaTheme="majorEastAsia" w:hAnsiTheme="majorHAnsi" w:cstheme="majorBidi"/>
+      <w:color w:val="0F4761" w:themeColor="accent1" w:themeShade="BF"/>
       <w:sz w:val="40"/>
       <w:szCs w:val="40"/>
     </w:rPr>
   </w:style>
-  <w:style w:type="character" w:styleId="2" w:customStyle="1">
+  <w:style w:type="character" w:customStyle="1" w:styleId="20">
     <w:name w:val="Заголовок 2 Знак"/>
-    <w:basedOn w:val="DefaultParagraphFont"/>
-    <w:link w:val="Heading2"/>
+    <w:basedOn w:val="a0"/>
+    <w:link w:val="2"/>
     <w:uiPriority w:val="9"/>
     <w:semiHidden/>
     <w:qFormat/>
-    <w:rsid w:val="00e731f3"/>
+    <w:rsid w:val="00E731F3"/>
     <w:rPr>
-      <w:rFonts w:ascii="Aptos Display" w:hAnsi="Aptos Display" w:eastAsia="" w:cs="" w:asciiTheme="majorHAnsi" w:cstheme="majorBidi" w:eastAsiaTheme="majorEastAsia" w:hAnsiTheme="majorHAnsi"/>
-      <w:color w:themeColor="accent1" w:themeShade="bf" w:val="0F4761"/>
+      <w:rFonts w:asciiTheme="majorHAnsi" w:eastAsiaTheme="majorEastAsia" w:hAnsiTheme="majorHAnsi" w:cstheme="majorBidi"/>
+      <w:color w:val="0F4761" w:themeColor="accent1" w:themeShade="BF"/>
       <w:sz w:val="32"/>
       <w:szCs w:val="32"/>
     </w:rPr>
   </w:style>
-  <w:style w:type="character" w:styleId="3" w:customStyle="1">
+  <w:style w:type="character" w:customStyle="1" w:styleId="30">
     <w:name w:val="Заголовок 3 Знак"/>
-    <w:basedOn w:val="DefaultParagraphFont"/>
-    <w:link w:val="Heading3"/>
+    <w:basedOn w:val="a0"/>
+    <w:link w:val="3"/>
     <w:uiPriority w:val="9"/>
     <w:semiHidden/>
     <w:qFormat/>
-    <w:rsid w:val="00e731f3"/>
+    <w:rsid w:val="00E731F3"/>
     <w:rPr>
-      <w:rFonts w:eastAsia="" w:cs="" w:cstheme="majorBidi" w:eastAsiaTheme="majorEastAsia"/>
-      <w:color w:themeColor="accent1" w:themeShade="bf" w:val="0F4761"/>
+      <w:rFonts w:eastAsiaTheme="majorEastAsia" w:cstheme="majorBidi"/>
+      <w:color w:val="0F4761" w:themeColor="accent1" w:themeShade="BF"/>
       <w:sz w:val="28"/>
       <w:szCs w:val="28"/>
     </w:rPr>
   </w:style>
-  <w:style w:type="character" w:styleId="4" w:customStyle="1">
+  <w:style w:type="character" w:customStyle="1" w:styleId="40">
     <w:name w:val="Заголовок 4 Знак"/>
-    <w:basedOn w:val="DefaultParagraphFont"/>
-    <w:link w:val="Heading4"/>
+    <w:basedOn w:val="a0"/>
+    <w:link w:val="4"/>
     <w:uiPriority w:val="9"/>
     <w:semiHidden/>
     <w:qFormat/>
-    <w:rsid w:val="00e731f3"/>
+    <w:rsid w:val="00E731F3"/>
     <w:rPr>
-      <w:rFonts w:eastAsia="" w:cs="" w:cstheme="majorBidi" w:eastAsiaTheme="majorEastAsia"/>
+      <w:rFonts w:eastAsiaTheme="majorEastAsia" w:cstheme="majorBidi"/>
       <w:i/>
       <w:iCs/>
-      <w:color w:themeColor="accent1" w:themeShade="bf" w:val="0F4761"/>
+      <w:color w:val="0F4761" w:themeColor="accent1" w:themeShade="BF"/>
     </w:rPr>
   </w:style>
-  <w:style w:type="character" w:styleId="5" w:customStyle="1">
+  <w:style w:type="character" w:customStyle="1" w:styleId="50">
     <w:name w:val="Заголовок 5 Знак"/>
-    <w:basedOn w:val="DefaultParagraphFont"/>
-    <w:link w:val="Heading5"/>
+    <w:basedOn w:val="a0"/>
+    <w:link w:val="5"/>
     <w:uiPriority w:val="9"/>
     <w:semiHidden/>
     <w:qFormat/>
-    <w:rsid w:val="00e731f3"/>
+    <w:rsid w:val="00E731F3"/>
     <w:rPr>
-      <w:rFonts w:eastAsia="" w:cs="" w:cstheme="majorBidi" w:eastAsiaTheme="majorEastAsia"/>
-      <w:color w:themeColor="accent1" w:themeShade="bf" w:val="0F4761"/>
+      <w:rFonts w:eastAsiaTheme="majorEastAsia" w:cstheme="majorBidi"/>
+      <w:color w:val="0F4761" w:themeColor="accent1" w:themeShade="BF"/>
     </w:rPr>
   </w:style>
-  <w:style w:type="character" w:styleId="6" w:customStyle="1">
+  <w:style w:type="character" w:customStyle="1" w:styleId="60">
     <w:name w:val="Заголовок 6 Знак"/>
-    <w:basedOn w:val="DefaultParagraphFont"/>
-    <w:link w:val="Heading6"/>
+    <w:basedOn w:val="a0"/>
+    <w:link w:val="6"/>
     <w:uiPriority w:val="9"/>
     <w:semiHidden/>
     <w:qFormat/>
-    <w:rsid w:val="00e731f3"/>
+    <w:rsid w:val="00E731F3"/>
     <w:rPr>
-      <w:rFonts w:eastAsia="" w:cs="" w:cstheme="majorBidi" w:eastAsiaTheme="majorEastAsia"/>
+      <w:rFonts w:eastAsiaTheme="majorEastAsia" w:cstheme="majorBidi"/>
       <w:i/>
       <w:iCs/>
-      <w:color w:themeColor="text1" w:themeTint="a6" w:val="595959"/>
+      <w:color w:val="595959" w:themeColor="text1" w:themeTint="A6"/>
     </w:rPr>
   </w:style>
-  <w:style w:type="character" w:styleId="7" w:customStyle="1">
+  <w:style w:type="character" w:customStyle="1" w:styleId="70">
     <w:name w:val="Заголовок 7 Знак"/>
-    <w:basedOn w:val="DefaultParagraphFont"/>
-    <w:link w:val="Heading7"/>
+    <w:basedOn w:val="a0"/>
+    <w:link w:val="7"/>
     <w:uiPriority w:val="9"/>
     <w:semiHidden/>
     <w:qFormat/>
-    <w:rsid w:val="00e731f3"/>
+    <w:rsid w:val="00E731F3"/>
     <w:rPr>
-      <w:rFonts w:eastAsia="" w:cs="" w:cstheme="majorBidi" w:eastAsiaTheme="majorEastAsia"/>
-      <w:color w:themeColor="text1" w:themeTint="a6" w:val="595959"/>
+      <w:rFonts w:eastAsiaTheme="majorEastAsia" w:cstheme="majorBidi"/>
+      <w:color w:val="595959" w:themeColor="text1" w:themeTint="A6"/>
     </w:rPr>
   </w:style>
-  <w:style w:type="character" w:styleId="8" w:customStyle="1">
+  <w:style w:type="character" w:customStyle="1" w:styleId="80">
     <w:name w:val="Заголовок 8 Знак"/>
-    <w:basedOn w:val="DefaultParagraphFont"/>
-    <w:link w:val="Heading8"/>
+    <w:basedOn w:val="a0"/>
+    <w:link w:val="8"/>
     <w:uiPriority w:val="9"/>
     <w:semiHidden/>
     <w:qFormat/>
-    <w:rsid w:val="00e731f3"/>
+    <w:rsid w:val="00E731F3"/>
     <w:rPr>
-      <w:rFonts w:eastAsia="" w:cs="" w:cstheme="majorBidi" w:eastAsiaTheme="majorEastAsia"/>
+      <w:rFonts w:eastAsiaTheme="majorEastAsia" w:cstheme="majorBidi"/>
       <w:i/>
       <w:iCs/>
-      <w:color w:themeColor="text1" w:themeTint="d8" w:val="272727"/>
+      <w:color w:val="272727" w:themeColor="text1" w:themeTint="D8"/>
     </w:rPr>
   </w:style>
-  <w:style w:type="character" w:styleId="9" w:customStyle="1">
+  <w:style w:type="character" w:customStyle="1" w:styleId="90">
     <w:name w:val="Заголовок 9 Знак"/>
-    <w:basedOn w:val="DefaultParagraphFont"/>
-    <w:link w:val="Heading9"/>
+    <w:basedOn w:val="a0"/>
+    <w:link w:val="9"/>
     <w:uiPriority w:val="9"/>
     <w:semiHidden/>
     <w:qFormat/>
-    <w:rsid w:val="00e731f3"/>
+    <w:rsid w:val="00E731F3"/>
     <w:rPr>
-      <w:rFonts w:eastAsia="" w:cs="" w:cstheme="majorBidi" w:eastAsiaTheme="majorEastAsia"/>
-      <w:color w:themeColor="text1" w:themeTint="d8" w:val="272727"/>
+      <w:rFonts w:eastAsiaTheme="majorEastAsia" w:cstheme="majorBidi"/>
+      <w:color w:val="272727" w:themeColor="text1" w:themeTint="D8"/>
     </w:rPr>
   </w:style>
-  <w:style w:type="character" w:styleId="Style5" w:customStyle="1">
+  <w:style w:type="character" w:customStyle="1" w:styleId="a3">
     <w:name w:val="Заголовок Знак"/>
-    <w:basedOn w:val="DefaultParagraphFont"/>
-    <w:link w:val="Title"/>
+    <w:basedOn w:val="a0"/>
+    <w:link w:val="a4"/>
     <w:uiPriority w:val="10"/>
     <w:qFormat/>
-    <w:rsid w:val="00e731f3"/>
+    <w:rsid w:val="00E731F3"/>
     <w:rPr>
-      <w:rFonts w:ascii="Aptos Display" w:hAnsi="Aptos Display" w:eastAsia="" w:cs="" w:asciiTheme="majorHAnsi" w:cstheme="majorBidi" w:eastAsiaTheme="majorEastAsia" w:hAnsiTheme="majorHAnsi"/>
+      <w:rFonts w:asciiTheme="majorHAnsi" w:eastAsiaTheme="majorEastAsia" w:hAnsiTheme="majorHAnsi" w:cstheme="majorBidi"/>
       <w:spacing w:val="-10"/>
       <w:kern w:val="2"/>
       <w:sz w:val="56"/>
       <w:szCs w:val="56"/>
     </w:rPr>
   </w:style>
-  <w:style w:type="character" w:styleId="Style6" w:customStyle="1">
+  <w:style w:type="character" w:customStyle="1" w:styleId="a5">
     <w:name w:val="Подзаголовок Знак"/>
-    <w:basedOn w:val="DefaultParagraphFont"/>
-    <w:link w:val="Subtitle"/>
+    <w:basedOn w:val="a0"/>
+    <w:link w:val="a6"/>
     <w:uiPriority w:val="11"/>
     <w:qFormat/>
-    <w:rsid w:val="00e731f3"/>
+    <w:rsid w:val="00E731F3"/>
     <w:rPr>
-      <w:rFonts w:eastAsia="" w:cs="" w:cstheme="majorBidi" w:eastAsiaTheme="majorEastAsia"/>
-      <w:color w:themeColor="text1" w:themeTint="a6" w:val="595959"/>
+      <w:rFonts w:eastAsiaTheme="majorEastAsia" w:cstheme="majorBidi"/>
+      <w:color w:val="595959" w:themeColor="text1" w:themeTint="A6"/>
       <w:spacing w:val="15"/>
       <w:sz w:val="28"/>
       <w:szCs w:val="28"/>
     </w:rPr>
   </w:style>
-  <w:style w:type="character" w:styleId="21" w:customStyle="1">
+  <w:style w:type="character" w:customStyle="1" w:styleId="21">
     <w:name w:val="Цитата 2 Знак"/>
-    <w:basedOn w:val="DefaultParagraphFont"/>
-    <w:link w:val="Quote"/>
+    <w:basedOn w:val="a0"/>
+    <w:link w:val="22"/>
     <w:uiPriority w:val="29"/>
     <w:qFormat/>
-    <w:rsid w:val="00e731f3"/>
+    <w:rsid w:val="00E731F3"/>
     <w:rPr>
       <w:i/>
       <w:iCs/>
-      <w:color w:themeColor="text1" w:themeTint="bf" w:val="404040"/>
+      <w:color w:val="404040" w:themeColor="text1" w:themeTint="BF"/>
     </w:rPr>
   </w:style>
-  <w:style w:type="character" w:styleId="IntenseEmphasis">
+  <w:style w:type="character" w:styleId="a7">
     <w:name w:val="Intense Emphasis"/>
-    <w:basedOn w:val="DefaultParagraphFont"/>
+    <w:basedOn w:val="a0"/>
     <w:uiPriority w:val="21"/>
     <w:qFormat/>
-    <w:rsid w:val="00e731f3"/>
+    <w:rsid w:val="00E731F3"/>
     <w:rPr>
       <w:i/>
       <w:iCs/>
-      <w:color w:themeColor="accent1" w:themeShade="bf" w:val="0F4761"/>
+      <w:color w:val="0F4761" w:themeColor="accent1" w:themeShade="BF"/>
     </w:rPr>
   </w:style>
-  <w:style w:type="character" w:styleId="Style7" w:customStyle="1">
+  <w:style w:type="character" w:customStyle="1" w:styleId="a8">
     <w:name w:val="Выделенная цитата Знак"/>
-    <w:basedOn w:val="DefaultParagraphFont"/>
-    <w:link w:val="IntenseQuote"/>
+    <w:basedOn w:val="a0"/>
+    <w:link w:val="a9"/>
     <w:uiPriority w:val="30"/>
     <w:qFormat/>
-    <w:rsid w:val="00e731f3"/>
+    <w:rsid w:val="00E731F3"/>
     <w:rPr>
       <w:i/>
       <w:iCs/>
-      <w:color w:themeColor="accent1" w:themeShade="bf" w:val="0F4761"/>
+      <w:color w:val="0F4761" w:themeColor="accent1" w:themeShade="BF"/>
     </w:rPr>
   </w:style>
-  <w:style w:type="character" w:styleId="IntenseReference">
+  <w:style w:type="character" w:styleId="aa">
     <w:name w:val="Intense Reference"/>
-    <w:basedOn w:val="DefaultParagraphFont"/>
+    <w:basedOn w:val="a0"/>
     <w:uiPriority w:val="32"/>
     <w:qFormat/>
-    <w:rsid w:val="00e731f3"/>
+    <w:rsid w:val="00E731F3"/>
     <w:rPr>
       <w:b/>
       <w:bCs/>
       <w:smallCaps/>
-      <w:color w:themeColor="accent1" w:themeShade="bf" w:val="0F4761"/>
+      <w:color w:val="0F4761" w:themeColor="accent1" w:themeShade="BF"/>
       <w:spacing w:val="5"/>
     </w:rPr>
   </w:style>
-  <w:style w:type="character" w:styleId="Hyperlink">
+  <w:style w:type="character" w:styleId="ab">
     <w:name w:val="Hyperlink"/>
-    <w:basedOn w:val="DefaultParagraphFont"/>
+    <w:basedOn w:val="a0"/>
     <w:uiPriority w:val="99"/>
     <w:unhideWhenUsed/>
-    <w:rsid w:val="00e731f3"/>
+    <w:rsid w:val="00E731F3"/>
     <w:rPr>
-      <w:color w:themeColor="hyperlink" w:val="467886"/>
+      <w:color w:val="467886" w:themeColor="hyperlink"/>
       <w:u w:val="single"/>
     </w:rPr>
   </w:style>
-  <w:style w:type="character" w:styleId="UnresolvedMention">
+  <w:style w:type="character" w:styleId="ac">
     <w:name w:val="Unresolved Mention"/>
-    <w:basedOn w:val="DefaultParagraphFont"/>
+    <w:basedOn w:val="a0"/>
     <w:uiPriority w:val="99"/>
     <w:semiHidden/>
     <w:unhideWhenUsed/>
     <w:qFormat/>
-    <w:rsid w:val="006352a6"/>
+    <w:rsid w:val="006352A6"/>
     <w:rPr>
       <w:color w:val="605E5C"/>
-      <w:shd w:fill="E1DFDD" w:val="clear"/>
+      <w:shd w:val="clear" w:color="auto" w:fill="E1DFDD"/>
     </w:rPr>
   </w:style>
-  <w:style w:type="paragraph" w:styleId="Heading">
+  <w:style w:type="paragraph" w:customStyle="1" w:styleId="Heading">
     <w:name w:val="Heading"/>
-    <w:basedOn w:val="Normal"/>
-    <w:next w:val="BodyText"/>
+    <w:basedOn w:val="a"/>
+    <w:next w:val="ad"/>
     <w:qFormat/>
     <w:pPr>
-      <w:keepNext w:val="true"/>
+      <w:keepNext/>
       <w:spacing w:before="240" w:after="120"/>
     </w:pPr>
     <w:rPr>
-      <w:rFonts w:ascii="Liberation Sans" w:hAnsi="Liberation Sans" w:eastAsia="Noto Sans CJK SC" w:cs="Noto Sans Devanagari"/>
+      <w:rFonts w:ascii="Liberation Sans" w:eastAsia="Noto Sans CJK SC" w:hAnsi="Liberation Sans" w:cs="Noto Sans Devanagari"/>
       <w:sz w:val="28"/>
       <w:szCs w:val="28"/>
     </w:rPr>
   </w:style>
-  <w:style w:type="paragraph" w:styleId="BodyText">
+  <w:style w:type="paragraph" w:styleId="ad">
     <w:name w:val="Body Text"/>
-    <w:basedOn w:val="Normal"/>
+    <w:basedOn w:val="a"/>
     <w:pPr>
-      <w:spacing w:lineRule="auto" w:line="276" w:before="0" w:after="140"/>
+      <w:spacing w:after="140" w:line="276" w:lineRule="auto"/>
     </w:pPr>
-    <w:rPr/>
-  </w:style>
-  <w:style w:type="paragraph" w:styleId="List">
+  </w:style>
+  <w:style w:type="paragraph" w:styleId="ae">
     <w:name w:val="List"/>
-    <w:basedOn w:val="BodyText"/>
-    <w:pPr/>
+    <w:basedOn w:val="ad"/>
     <w:rPr>
       <w:rFonts w:cs="Noto Sans Devanagari"/>
     </w:rPr>
   </w:style>
-  <w:style w:type="paragraph" w:styleId="Caption">
+  <w:style w:type="paragraph" w:styleId="af">
     <w:name w:val="caption"/>
-    <w:basedOn w:val="Normal"/>
+    <w:basedOn w:val="a"/>
     <w:qFormat/>
     <w:pPr>
       <w:suppressLineNumbers/>
@@ -3099,9 +3216,9 @@
       <w:szCs w:val="24"/>
     </w:rPr>
   </w:style>
-  <w:style w:type="paragraph" w:styleId="Index">
+  <w:style w:type="paragraph" w:customStyle="1" w:styleId="Index">
     <w:name w:val="Index"/>
-    <w:basedOn w:val="Normal"/>
+    <w:basedOn w:val="a"/>
     <w:qFormat/>
     <w:pPr>
       <w:suppressLineNumbers/>
@@ -3110,170 +3227,145 @@
       <w:rFonts w:cs="Noto Sans Devanagari"/>
     </w:rPr>
   </w:style>
-  <w:style w:type="paragraph" w:styleId="Title">
+  <w:style w:type="paragraph" w:styleId="a4">
     <w:name w:val="Title"/>
-    <w:basedOn w:val="Normal"/>
-    <w:next w:val="Normal"/>
-    <w:link w:val="Style5"/>
+    <w:basedOn w:val="a"/>
+    <w:next w:val="a"/>
+    <w:link w:val="a3"/>
     <w:uiPriority w:val="10"/>
     <w:qFormat/>
-    <w:rsid w:val="00e731f3"/>
+    <w:rsid w:val="00E731F3"/>
     <w:pPr>
-      <w:spacing w:lineRule="auto" w:line="240" w:before="0" w:after="80"/>
+      <w:spacing w:after="80" w:line="240" w:lineRule="auto"/>
       <w:contextualSpacing/>
     </w:pPr>
     <w:rPr>
-      <w:rFonts w:ascii="Aptos Display" w:hAnsi="Aptos Display" w:eastAsia="" w:cs="" w:asciiTheme="majorHAnsi" w:cstheme="majorBidi" w:eastAsiaTheme="majorEastAsia" w:hAnsiTheme="majorHAnsi"/>
+      <w:rFonts w:asciiTheme="majorHAnsi" w:eastAsiaTheme="majorEastAsia" w:hAnsiTheme="majorHAnsi" w:cstheme="majorBidi"/>
       <w:spacing w:val="-10"/>
-      <w:kern w:val="2"/>
       <w:sz w:val="56"/>
       <w:szCs w:val="56"/>
     </w:rPr>
   </w:style>
-  <w:style w:type="paragraph" w:styleId="Subtitle">
+  <w:style w:type="paragraph" w:styleId="a6">
     <w:name w:val="Subtitle"/>
-    <w:basedOn w:val="Normal"/>
-    <w:next w:val="Normal"/>
-    <w:link w:val="Style6"/>
+    <w:basedOn w:val="a"/>
+    <w:next w:val="a"/>
+    <w:link w:val="a5"/>
     <w:uiPriority w:val="11"/>
     <w:qFormat/>
-    <w:rsid w:val="00e731f3"/>
-    <w:pPr/>
+    <w:rsid w:val="00E731F3"/>
     <w:rPr>
-      <w:rFonts w:eastAsia="" w:cs="" w:cstheme="majorBidi" w:eastAsiaTheme="majorEastAsia"/>
-      <w:color w:themeColor="text1" w:themeTint="a6" w:val="595959"/>
+      <w:rFonts w:eastAsiaTheme="majorEastAsia" w:cstheme="majorBidi"/>
+      <w:color w:val="595959" w:themeColor="text1" w:themeTint="A6"/>
       <w:spacing w:val="15"/>
       <w:sz w:val="28"/>
       <w:szCs w:val="28"/>
     </w:rPr>
   </w:style>
-  <w:style w:type="paragraph" w:styleId="Quote">
+  <w:style w:type="paragraph" w:styleId="22">
     <w:name w:val="Quote"/>
-    <w:basedOn w:val="Normal"/>
-    <w:next w:val="Normal"/>
+    <w:basedOn w:val="a"/>
+    <w:next w:val="a"/>
     <w:link w:val="21"/>
     <w:uiPriority w:val="29"/>
     <w:qFormat/>
-    <w:rsid w:val="00e731f3"/>
+    <w:rsid w:val="00E731F3"/>
     <w:pPr>
-      <w:spacing w:before="160" w:after="160"/>
+      <w:spacing w:before="160"/>
       <w:jc w:val="center"/>
     </w:pPr>
     <w:rPr>
       <w:i/>
       <w:iCs/>
-      <w:color w:themeColor="text1" w:themeTint="bf" w:val="404040"/>
+      <w:color w:val="404040" w:themeColor="text1" w:themeTint="BF"/>
     </w:rPr>
   </w:style>
-  <w:style w:type="paragraph" w:styleId="ListParagraph">
+  <w:style w:type="paragraph" w:styleId="af0">
     <w:name w:val="List Paragraph"/>
-    <w:basedOn w:val="Normal"/>
+    <w:basedOn w:val="a"/>
     <w:uiPriority w:val="34"/>
     <w:qFormat/>
-    <w:rsid w:val="00e731f3"/>
+    <w:rsid w:val="00E731F3"/>
     <w:pPr>
-      <w:spacing w:before="0" w:after="160"/>
-      <w:ind w:start="720"/>
+      <w:ind w:left="720"/>
       <w:contextualSpacing/>
     </w:pPr>
-    <w:rPr/>
-  </w:style>
-  <w:style w:type="paragraph" w:styleId="IntenseQuote">
+  </w:style>
+  <w:style w:type="paragraph" w:styleId="a9">
     <w:name w:val="Intense Quote"/>
-    <w:basedOn w:val="Normal"/>
-    <w:next w:val="Normal"/>
-    <w:link w:val="Style7"/>
+    <w:basedOn w:val="a"/>
+    <w:next w:val="a"/>
+    <w:link w:val="a8"/>
     <w:uiPriority w:val="30"/>
     <w:qFormat/>
-    <w:rsid w:val="00e731f3"/>
+    <w:rsid w:val="00E731F3"/>
     <w:pPr>
       <w:pBdr>
-        <w:top w:val="single" w:sz="4" w:space="10" w:color="0F4761" w:themeColor="accent1" w:themeShade="bf"/>
-        <w:bottom w:val="single" w:sz="4" w:space="10" w:color="0F4761" w:themeColor="accent1" w:themeShade="bf"/>
+        <w:top w:val="single" w:sz="4" w:space="10" w:color="0F4761" w:themeColor="accent1" w:themeShade="BF"/>
+        <w:bottom w:val="single" w:sz="4" w:space="10" w:color="0F4761" w:themeColor="accent1" w:themeShade="BF"/>
       </w:pBdr>
       <w:spacing w:before="360" w:after="360"/>
-      <w:ind w:start="864" w:end="864"/>
+      <w:ind w:left="864" w:right="864"/>
       <w:jc w:val="center"/>
     </w:pPr>
     <w:rPr>
       <w:i/>
       <w:iCs/>
-      <w:color w:themeColor="accent1" w:themeShade="bf" w:val="0F4761"/>
+      <w:color w:val="0F4761" w:themeColor="accent1" w:themeShade="BF"/>
     </w:rPr>
-  </w:style>
-  <w:style w:type="numbering" w:styleId="NoList" w:default="1">
-    <w:name w:val="No List"/>
-    <w:uiPriority w:val="99"/>
-    <w:semiHidden/>
-    <w:unhideWhenUsed/>
-    <w:qFormat/>
-  </w:style>
-  <w:style w:type="table" w:default="1" w:styleId="a1">
-    <w:name w:val="Normal Table"/>
-    <w:uiPriority w:val="99"/>
-    <w:semiHidden/>
-    <w:unhideWhenUsed/>
-    <w:tblPr>
-      <w:tblCellMar>
-        <w:top w:w="0" w:type="dxa"/>
-        <w:left w:w="108" w:type="dxa"/>
-        <w:bottom w:w="0" w:type="dxa"/>
-        <w:right w:w="108" w:type="dxa"/>
-      </w:tblCellMar>
-    </w:tblPr>
   </w:style>
 </w:styles>
 </file>
 
 <file path=word/theme/theme1.xml><?xml version="1.0" encoding="utf-8"?>
-<a:theme xmlns:a="http://schemas.openxmlformats.org/drawingml/2006/main" xmlns:r="http://schemas.openxmlformats.org/officeDocument/2006/relationships" name="Тема Office">
+<a:theme xmlns:a="http://schemas.openxmlformats.org/drawingml/2006/main" name="Тема Office">
   <a:themeElements>
     <a:clrScheme name="Стандартная">
       <a:dk1>
         <a:srgbClr val="000000"/>
       </a:dk1>
       <a:lt1>
-        <a:srgbClr val="ffffff"/>
+        <a:srgbClr val="FFFFFF"/>
       </a:lt1>
       <a:dk2>
-        <a:srgbClr val="0e2841"/>
+        <a:srgbClr val="0E2841"/>
       </a:dk2>
       <a:lt2>
-        <a:srgbClr val="e8e8e8"/>
+        <a:srgbClr val="E8E8E8"/>
       </a:lt2>
       <a:accent1>
         <a:srgbClr val="156082"/>
       </a:accent1>
       <a:accent2>
-        <a:srgbClr val="e97132"/>
+        <a:srgbClr val="E97132"/>
       </a:accent2>
       <a:accent3>
-        <a:srgbClr val="196b24"/>
+        <a:srgbClr val="196B24"/>
       </a:accent3>
       <a:accent4>
-        <a:srgbClr val="0f9ed5"/>
+        <a:srgbClr val="0F9ED5"/>
       </a:accent4>
       <a:accent5>
-        <a:srgbClr val="a02b93"/>
+        <a:srgbClr val="A02B93"/>
       </a:accent5>
       <a:accent6>
-        <a:srgbClr val="4ea72e"/>
+        <a:srgbClr val="4EA72E"/>
       </a:accent6>
       <a:hlink>
         <a:srgbClr val="467886"/>
       </a:hlink>
       <a:folHlink>
-        <a:srgbClr val="96607d"/>
+        <a:srgbClr val="96607D"/>
       </a:folHlink>
     </a:clrScheme>
     <a:fontScheme name="Стандартная">
       <a:majorFont>
-        <a:latin typeface="Aptos Display" panose="02110004020202020204" pitchFamily="0" charset="1"/>
+        <a:latin typeface="Aptos Display" panose="02110004020202020204"/>
         <a:ea typeface=""/>
         <a:cs typeface=""/>
       </a:majorFont>
       <a:minorFont>
-        <a:latin typeface="Aptos" panose="02110004020202020204" pitchFamily="0" charset="1"/>
+        <a:latin typeface="Aptos" panose="02110004020202020204"/>
         <a:ea typeface=""/>
         <a:cs typeface=""/>
       </a:minorFont>
@@ -3305,7 +3397,7 @@
             </a:gs>
           </a:gsLst>
           <a:lin ang="5400000" scaled="0"/>
-          <a:tileRect l="0" t="0" r="0" b="0"/>
+          <a:tileRect/>
         </a:gradFill>
         <a:gradFill>
           <a:gsLst>
@@ -3329,7 +3421,7 @@
             </a:gs>
           </a:gsLst>
           <a:lin ang="5400000" scaled="0"/>
-          <a:tileRect l="0" t="0" r="0" b="0"/>
+          <a:tileRect/>
         </a:gradFill>
       </a:fillStyleLst>
       <a:lnStyleLst>
@@ -3389,10 +3481,12 @@
             </a:gs>
           </a:gsLst>
           <a:lin ang="5400000" scaled="0"/>
-          <a:tileRect l="0" t="0" r="0" b="0"/>
+          <a:tileRect/>
         </a:gradFill>
       </a:bgFillStyleLst>
     </a:fmtScheme>
   </a:themeElements>
+  <a:objectDefaults/>
+  <a:extraClrSchemeLst/>
 </a:theme>
 </file>
</xml_diff>